<commit_message>
Add small knife cut positions to calibration GUI and update configurations
</commit_message>
<xml_diff>
--- a/מצגת.docx
+++ b/מצגת.docx
@@ -6,15 +6,177 @@
       <w:pPr>
         <w:numPr>
           <w:ilvl w:val="0"/>
-          <w:numId w:val="1"/>
+          <w:numId w:val="22"/>
         </w:numPr>
         <w:bidi/>
+        <w:rPr>
+          <w:lang w:val="en-IL"/>
+        </w:rPr>
       </w:pPr>
       <w:r>
         <w:rPr>
           <w:rtl/>
         </w:rPr>
         <w:t>הצגת הקבוצה</w:t>
+      </w:r>
+    </w:p>
+    <w:p>
+      <w:pPr>
+        <w:numPr>
+          <w:ilvl w:val="0"/>
+          <w:numId w:val="22"/>
+        </w:numPr>
+        <w:bidi/>
+        <w:rPr>
+          <w:lang w:val="en-IL"/>
+        </w:rPr>
+      </w:pPr>
+      <w:r>
+        <w:rPr>
+          <w:rtl/>
+        </w:rPr>
+        <w:t>הצגת הבעיה המקורית</w:t>
+      </w:r>
+    </w:p>
+    <w:p>
+      <w:pPr>
+        <w:numPr>
+          <w:ilvl w:val="0"/>
+          <w:numId w:val="22"/>
+        </w:numPr>
+        <w:bidi/>
+        <w:rPr>
+          <w:lang w:val="en-IL"/>
+        </w:rPr>
+      </w:pPr>
+      <w:r>
+        <w:rPr>
+          <w:rtl/>
+        </w:rPr>
+        <w:t>מה ההבדלים בין תוכנית העבודה כפי שהוצגה בתחילת הסדנה לעומת מה שיצא בפועל</w:t>
+      </w:r>
+    </w:p>
+    <w:p>
+      <w:pPr>
+        <w:numPr>
+          <w:ilvl w:val="0"/>
+          <w:numId w:val="22"/>
+        </w:numPr>
+        <w:bidi/>
+        <w:rPr>
+          <w:lang w:val="en-IL"/>
+        </w:rPr>
+      </w:pPr>
+      <w:r>
+        <w:rPr>
+          <w:rtl/>
+        </w:rPr>
+        <w:t>הטכנולוגיות שנבחרו והסיבות</w:t>
+      </w:r>
+    </w:p>
+    <w:p>
+      <w:pPr>
+        <w:numPr>
+          <w:ilvl w:val="0"/>
+          <w:numId w:val="22"/>
+        </w:numPr>
+        <w:bidi/>
+        <w:rPr>
+          <w:lang w:val="en-IL"/>
+        </w:rPr>
+      </w:pPr>
+      <w:r>
+        <w:rPr>
+          <w:rtl/>
+        </w:rPr>
+        <w:t>הפונקציונאליות שנשארה בחוץ והסיבות</w:t>
+      </w:r>
+    </w:p>
+    <w:p>
+      <w:pPr>
+        <w:numPr>
+          <w:ilvl w:val="0"/>
+          <w:numId w:val="22"/>
+        </w:numPr>
+        <w:bidi/>
+        <w:rPr>
+          <w:lang w:val="en-IL"/>
+        </w:rPr>
+      </w:pPr>
+      <w:r>
+        <w:rPr>
+          <w:rtl/>
+        </w:rPr>
+        <w:t>שקף אחד עם תמונות מתהליך העבודה עצמו והחוויה של עבודה על פרויקט</w:t>
+      </w:r>
+    </w:p>
+    <w:p>
+      <w:pPr>
+        <w:numPr>
+          <w:ilvl w:val="0"/>
+          <w:numId w:val="22"/>
+        </w:numPr>
+        <w:bidi/>
+        <w:rPr>
+          <w:lang w:val="en-IL"/>
+        </w:rPr>
+      </w:pPr>
+      <w:r>
+        <w:rPr>
+          <w:rtl/>
+        </w:rPr>
+        <w:t>תיאור המוצר/האפליקציה בפועל</w:t>
+      </w:r>
+    </w:p>
+    <w:p>
+      <w:pPr>
+        <w:numPr>
+          <w:ilvl w:val="0"/>
+          <w:numId w:val="22"/>
+        </w:numPr>
+        <w:bidi/>
+        <w:rPr>
+          <w:lang w:val="en-IL"/>
+        </w:rPr>
+      </w:pPr>
+      <w:r>
+        <w:rPr>
+          <w:i/>
+          <w:iCs/>
+          <w:rtl/>
+        </w:rPr>
+        <w:t>אופציונאלי</w:t>
+      </w:r>
+      <w:r>
+        <w:rPr>
+          <w:lang w:val="en-IL"/>
+        </w:rPr>
+        <w:t xml:space="preserve">, </w:t>
+      </w:r>
+      <w:r>
+        <w:rPr>
+          <w:rtl/>
+        </w:rPr>
+        <w:t>למי שמעוניין שהפרויקט שלו יישקל כמועמד לפרס קרן היזמות של בית הספר, הצגת הפוטנציאל המסחרי של הטכנולוגיה שפותחה. בין אם בפני עצמה, ובין אם כחלק ממוצר רחב יותר</w:t>
+      </w:r>
+      <w:r>
+        <w:rPr>
+          <w:lang w:val="en-IL"/>
+        </w:rPr>
+        <w:t>. </w:t>
+      </w:r>
+    </w:p>
+    <w:p>
+      <w:pPr>
+        <w:rPr>
+          <w:lang w:val="en-US"/>
+        </w:rPr>
+      </w:pPr>
+      <w:r>
+        <w:rPr>
+          <w:rtl/>
+        </w:rPr>
+        <w:br w:type="page"/>
       </w:r>
     </w:p>
     <w:p>
@@ -24,11 +186,18 @@
           <w:numId w:val="1"/>
         </w:numPr>
         <w:bidi/>
-      </w:pPr>
-      <w:r>
-        <w:rPr>
-          <w:rtl/>
-        </w:rPr>
+        <w:rPr>
+          <w:b/>
+          <w:bCs/>
+        </w:rPr>
+      </w:pPr>
+      <w:r>
+        <w:rPr>
+          <w:b/>
+          <w:bCs/>
+          <w:rtl/>
+        </w:rPr>
+        <w:lastRenderedPageBreak/>
         <w:t>הצגת הבעיה המקורית</w:t>
       </w:r>
     </w:p>
@@ -88,7 +257,21 @@
         <w:rPr>
           <w:lang w:val="en-US"/>
         </w:rPr>
-        <w:t>Create drawing in the program:</w:t>
+        <w:t xml:space="preserve">Create </w:t>
+      </w:r>
+      <w:proofErr w:type="gramStart"/>
+      <w:r>
+        <w:rPr>
+          <w:lang w:val="en-US"/>
+        </w:rPr>
+        <w:t>drawing</w:t>
+      </w:r>
+      <w:proofErr w:type="gramEnd"/>
+      <w:r>
+        <w:rPr>
+          <w:lang w:val="en-US"/>
+        </w:rPr>
+        <w:t xml:space="preserve"> in the program:</w:t>
       </w:r>
     </w:p>
     <w:p>
@@ -105,7 +288,21 @@
         <w:rPr>
           <w:lang w:val="en-US"/>
         </w:rPr>
-        <w:t>Take high definition picture of the subject</w:t>
+        <w:t xml:space="preserve">Take </w:t>
+      </w:r>
+      <w:proofErr w:type="gramStart"/>
+      <w:r>
+        <w:rPr>
+          <w:lang w:val="en-US"/>
+        </w:rPr>
+        <w:t>high definition</w:t>
+      </w:r>
+      <w:proofErr w:type="gramEnd"/>
+      <w:r>
+        <w:rPr>
+          <w:lang w:val="en-US"/>
+        </w:rPr>
+        <w:t xml:space="preserve"> picture of the subject</w:t>
       </w:r>
       <w:r>
         <w:rPr>
@@ -210,7 +407,27 @@
           <w:u w:val="single"/>
           <w:lang w:val="en-US"/>
         </w:rPr>
-        <w:t>Draw strokes on page (poc)</w:t>
+        <w:t>Draw strokes on page (</w:t>
+      </w:r>
+      <w:proofErr w:type="spellStart"/>
+      <w:r>
+        <w:rPr>
+          <w:b/>
+          <w:bCs/>
+          <w:u w:val="single"/>
+          <w:lang w:val="en-US"/>
+        </w:rPr>
+        <w:t>poc</w:t>
+      </w:r>
+      <w:proofErr w:type="spellEnd"/>
+      <w:r>
+        <w:rPr>
+          <w:b/>
+          <w:bCs/>
+          <w:u w:val="single"/>
+          <w:lang w:val="en-US"/>
+        </w:rPr>
+        <w:t>)</w:t>
       </w:r>
     </w:p>
     <w:p>
@@ -301,7 +518,27 @@
           <w:u w:val="single"/>
           <w:lang w:val="en-US"/>
         </w:rPr>
-        <w:t>Handing the drawing (nth):</w:t>
+        <w:t>Handing the drawing (</w:t>
+      </w:r>
+      <w:proofErr w:type="gramStart"/>
+      <w:r>
+        <w:rPr>
+          <w:b/>
+          <w:bCs/>
+          <w:u w:val="single"/>
+          <w:lang w:val="en-US"/>
+        </w:rPr>
+        <w:t>nth</w:t>
+      </w:r>
+      <w:proofErr w:type="gramEnd"/>
+      <w:r>
+        <w:rPr>
+          <w:b/>
+          <w:bCs/>
+          <w:u w:val="single"/>
+          <w:lang w:val="en-US"/>
+        </w:rPr>
+        <w:t>):</w:t>
       </w:r>
     </w:p>
     <w:p>
@@ -343,10 +580,28 @@
         <w:bidi/>
         <w:ind w:left="360"/>
         <w:rPr>
+          <w:rFonts w:hint="cs"/>
           <w:rtl/>
           <w:lang w:val="en-US"/>
         </w:rPr>
       </w:pPr>
+    </w:p>
+    <w:p>
+      <w:pPr>
+        <w:rPr>
+          <w:b/>
+          <w:bCs/>
+          <w:rtl/>
+        </w:rPr>
+      </w:pPr>
+      <w:r>
+        <w:rPr>
+          <w:b/>
+          <w:bCs/>
+          <w:rtl/>
+        </w:rPr>
+        <w:br w:type="page"/>
+      </w:r>
     </w:p>
     <w:p>
       <w:pPr>
@@ -355,11 +610,18 @@
           <w:numId w:val="1"/>
         </w:numPr>
         <w:bidi/>
-      </w:pPr>
-      <w:r>
-        <w:rPr>
-          <w:rtl/>
-        </w:rPr>
+        <w:rPr>
+          <w:b/>
+          <w:bCs/>
+        </w:rPr>
+      </w:pPr>
+      <w:r>
+        <w:rPr>
+          <w:b/>
+          <w:bCs/>
+          <w:rtl/>
+        </w:rPr>
+        <w:lastRenderedPageBreak/>
         <w:t>מה ההבדלים בין תוכנית העבודה כפי שהוצגה בתחילת הסדנה לעומת מה שיצא בפועל</w:t>
       </w:r>
     </w:p>
@@ -393,12 +655,14 @@
         </w:rPr>
         <w:t xml:space="preserve">תכננו להשתמש באלגוריתם המוכן של </w:t>
       </w:r>
+      <w:proofErr w:type="spellStart"/>
       <w:r>
         <w:rPr>
           <w:lang w:val="en-US"/>
         </w:rPr>
         <w:t>swiftsketch</w:t>
       </w:r>
+      <w:proofErr w:type="spellEnd"/>
       <w:r>
         <w:rPr>
           <w:rFonts w:hint="cs"/>
@@ -437,7 +701,23 @@
           <w:rFonts w:hint="cs"/>
           <w:rtl/>
         </w:rPr>
-        <w:t>על הלאמן מודל באמת להרחיב שזה לא היה מדויק</w:t>
+        <w:t xml:space="preserve">על </w:t>
+      </w:r>
+      <w:proofErr w:type="spellStart"/>
+      <w:r>
+        <w:rPr>
+          <w:rFonts w:hint="cs"/>
+          <w:rtl/>
+        </w:rPr>
+        <w:t>הלאמן</w:t>
+      </w:r>
+      <w:proofErr w:type="spellEnd"/>
+      <w:r>
+        <w:rPr>
+          <w:rFonts w:hint="cs"/>
+          <w:rtl/>
+        </w:rPr>
+        <w:t xml:space="preserve"> מודל באמת להרחיב שזה לא היה מדויק</w:t>
       </w:r>
       <w:r>
         <w:rPr>
@@ -458,7 +738,6 @@
         <w:rPr>
           <w:rtl/>
         </w:rPr>
-        <w:lastRenderedPageBreak/>
         <w:t>הפונקציונאליות שנשארה בחוץ והסיבות</w:t>
       </w:r>
       <w:r>
@@ -518,7 +797,23 @@
           <w:rFonts w:hint="cs"/>
           <w:rtl/>
         </w:rPr>
-        <w:t>ובמקום זא החלטנו לחתום קצת אחרת</w:t>
+        <w:t xml:space="preserve">ובמקום </w:t>
+      </w:r>
+      <w:proofErr w:type="spellStart"/>
+      <w:r>
+        <w:rPr>
+          <w:rFonts w:hint="cs"/>
+          <w:rtl/>
+        </w:rPr>
+        <w:t>זא</w:t>
+      </w:r>
+      <w:proofErr w:type="spellEnd"/>
+      <w:r>
+        <w:rPr>
+          <w:rFonts w:hint="cs"/>
+          <w:rtl/>
+        </w:rPr>
+        <w:t xml:space="preserve"> החלטנו לחתום קצת אחרת</w:t>
       </w:r>
       <w:r>
         <w:rPr>
@@ -550,7 +845,23 @@
           <w:rFonts w:hint="cs"/>
           <w:rtl/>
         </w:rPr>
-        <w:t>החלטנו להוסיף את גליל הנייר המתגלגל ולבצע את החלפת התמונות באמצעות שליפה של קטע דף, החזרקתו מוח באמצעות מגנטים וציור עליו</w:t>
+        <w:t xml:space="preserve">החלטנו להוסיף את גליל הנייר המתגלגל ולבצע את החלפת התמונות באמצעות שליפה של קטע דף, </w:t>
+      </w:r>
+      <w:proofErr w:type="spellStart"/>
+      <w:r>
+        <w:rPr>
+          <w:rFonts w:hint="cs"/>
+          <w:rtl/>
+        </w:rPr>
+        <w:t>החזרקתו</w:t>
+      </w:r>
+      <w:proofErr w:type="spellEnd"/>
+      <w:r>
+        <w:rPr>
+          <w:rFonts w:hint="cs"/>
+          <w:rtl/>
+        </w:rPr>
+        <w:t xml:space="preserve"> מוח באמצעות מגנטים וציור עליו</w:t>
       </w:r>
     </w:p>
     <w:p>
@@ -655,7 +966,23 @@
           <w:rFonts w:hint="cs"/>
           <w:rtl/>
         </w:rPr>
-        <w:t>מאשרים את הסקיצה ושולחים הפורטרטרון את הציור</w:t>
+        <w:t xml:space="preserve">מאשרים את הסקיצה ושולחים </w:t>
+      </w:r>
+      <w:proofErr w:type="spellStart"/>
+      <w:r>
+        <w:rPr>
+          <w:rFonts w:hint="cs"/>
+          <w:rtl/>
+        </w:rPr>
+        <w:t>הפורטרטרון</w:t>
+      </w:r>
+      <w:proofErr w:type="spellEnd"/>
+      <w:r>
+        <w:rPr>
+          <w:rFonts w:hint="cs"/>
+          <w:rtl/>
+        </w:rPr>
+        <w:t xml:space="preserve"> את הציור</w:t>
       </w:r>
     </w:p>
     <w:p>
@@ -667,12 +994,21 @@
         </w:numPr>
         <w:bidi/>
       </w:pPr>
+      <w:proofErr w:type="spellStart"/>
       <w:r>
         <w:rPr>
           <w:rFonts w:hint="cs"/>
           <w:rtl/>
         </w:rPr>
-        <w:t>הפורטרטרון:</w:t>
+        <w:t>הפורטרטרון</w:t>
+      </w:r>
+      <w:proofErr w:type="spellEnd"/>
+      <w:r>
+        <w:rPr>
+          <w:rFonts w:hint="cs"/>
+          <w:rtl/>
+        </w:rPr>
+        <w:t>:</w:t>
       </w:r>
       <w:r>
         <w:rPr>
@@ -760,7 +1096,23 @@
           <w:rFonts w:hint="cs"/>
           <w:rtl/>
         </w:rPr>
-        <w:t>חותך את הדף בעזתר החותך ומושיט אותו למשתמש</w:t>
+        <w:t xml:space="preserve">חותך את הדף </w:t>
+      </w:r>
+      <w:proofErr w:type="spellStart"/>
+      <w:r>
+        <w:rPr>
+          <w:rFonts w:hint="cs"/>
+          <w:rtl/>
+        </w:rPr>
+        <w:t>בעזתר</w:t>
+      </w:r>
+      <w:proofErr w:type="spellEnd"/>
+      <w:r>
+        <w:rPr>
+          <w:rFonts w:hint="cs"/>
+          <w:rtl/>
+        </w:rPr>
+        <w:t xml:space="preserve"> החותך ומושיט אותו למשתמש</w:t>
       </w:r>
     </w:p>
     <w:p>
@@ -807,6 +1159,7 @@
           <w:rFonts w:hint="cs"/>
           <w:rtl/>
         </w:rPr>
+        <w:lastRenderedPageBreak/>
         <w:t>האלגוריתם:</w:t>
       </w:r>
       <w:r>
@@ -877,7 +1230,43 @@
           <w:rtl/>
           <w:lang w:val="en-US"/>
         </w:rPr>
-        <w:t xml:space="preserve">מספר איטרציו חיברנו קווים  אוטימיזציות </w:t>
+        <w:t xml:space="preserve">מספר </w:t>
+      </w:r>
+      <w:proofErr w:type="spellStart"/>
+      <w:r>
+        <w:rPr>
+          <w:rFonts w:hint="cs"/>
+          <w:rtl/>
+          <w:lang w:val="en-US"/>
+        </w:rPr>
+        <w:t>איטרציו</w:t>
+      </w:r>
+      <w:proofErr w:type="spellEnd"/>
+      <w:r>
+        <w:rPr>
+          <w:rFonts w:hint="cs"/>
+          <w:rtl/>
+          <w:lang w:val="en-US"/>
+        </w:rPr>
+        <w:t xml:space="preserve"> חיברנו קווים  </w:t>
+      </w:r>
+      <w:proofErr w:type="spellStart"/>
+      <w:r>
+        <w:rPr>
+          <w:rFonts w:hint="cs"/>
+          <w:rtl/>
+          <w:lang w:val="en-US"/>
+        </w:rPr>
+        <w:t>אוטימיזציות</w:t>
+      </w:r>
+      <w:proofErr w:type="spellEnd"/>
+      <w:r>
+        <w:rPr>
+          <w:rFonts w:hint="cs"/>
+          <w:rtl/>
+          <w:lang w:val="en-US"/>
+        </w:rPr>
+        <w:t xml:space="preserve"> </w:t>
       </w:r>
       <w:r>
         <w:rPr>
@@ -929,7 +1318,6 @@
         <w:rPr>
           <w:b/>
           <w:bCs/>
-          <w:lang w:val="en-IL"/>
         </w:rPr>
       </w:pPr>
       <w:r>
@@ -939,25 +1327,27 @@
         <w:rPr>
           <w:b/>
           <w:bCs/>
-          <w:lang w:val="en-IL"/>
         </w:rPr>
         <w:lastRenderedPageBreak/>
         <w:t>Slide 1 — Team &amp; Project Introduction</w:t>
       </w:r>
     </w:p>
     <w:p>
-      <w:pPr>
-        <w:rPr>
-          <w:lang w:val="en-IL"/>
-        </w:rPr>
-      </w:pPr>
-      <w:r>
-        <w:rPr>
-          <w:b/>
-          <w:bCs/>
-          <w:lang w:val="en-IL"/>
-        </w:rPr>
-        <w:t>PortraTron – A Robotic System for Creating Personalized Portraits</w:t>
+      <w:proofErr w:type="spellStart"/>
+      <w:r>
+        <w:rPr>
+          <w:b/>
+          <w:bCs/>
+        </w:rPr>
+        <w:t>PortraTron</w:t>
+      </w:r>
+      <w:proofErr w:type="spellEnd"/>
+      <w:r>
+        <w:rPr>
+          <w:b/>
+          <w:bCs/>
+        </w:rPr>
+        <w:t xml:space="preserve"> – A Robotic System for Creating Personalized Portraits</w:t>
       </w:r>
     </w:p>
     <w:p>
@@ -965,28 +1355,18 @@
         <w:rPr>
           <w:i/>
           <w:iCs/>
-          <w:lang w:val="en-IL"/>
         </w:rPr>
       </w:pPr>
       <w:r>
         <w:rPr>
           <w:i/>
           <w:iCs/>
-          <w:lang w:val="en-IL"/>
         </w:rPr>
         <w:t>The goal of the project is to create an interactive experience in which a user takes a photo, receives a preview sketch, and a robot automatically draws a physical portrait on paper.</w:t>
       </w:r>
     </w:p>
     <w:p>
-      <w:pPr>
-        <w:rPr>
-          <w:lang w:val="en-IL"/>
-        </w:rPr>
-      </w:pPr>
-      <w:r>
-        <w:rPr>
-          <w:lang w:val="en-IL"/>
-        </w:rPr>
+      <w:r>
         <w:t>The system combines:</w:t>
       </w:r>
     </w:p>
@@ -996,14 +1376,8 @@
           <w:ilvl w:val="0"/>
           <w:numId w:val="3"/>
         </w:numPr>
-        <w:rPr>
-          <w:lang w:val="en-IL"/>
-        </w:rPr>
-      </w:pPr>
-      <w:r>
-        <w:rPr>
-          <w:lang w:val="en-IL"/>
-        </w:rPr>
+      </w:pPr>
+      <w:r>
         <w:t xml:space="preserve">Image processing and Machine Learning </w:t>
       </w:r>
     </w:p>
@@ -1013,14 +1387,8 @@
           <w:ilvl w:val="0"/>
           <w:numId w:val="3"/>
         </w:numPr>
-        <w:rPr>
-          <w:lang w:val="en-IL"/>
-        </w:rPr>
-      </w:pPr>
-      <w:r>
-        <w:rPr>
-          <w:lang w:val="en-IL"/>
-        </w:rPr>
+      </w:pPr>
+      <w:r>
         <w:t xml:space="preserve">Image-to-strokes conversion </w:t>
       </w:r>
     </w:p>
@@ -1030,14 +1398,8 @@
           <w:ilvl w:val="0"/>
           <w:numId w:val="3"/>
         </w:numPr>
-        <w:rPr>
-          <w:lang w:val="en-IL"/>
-        </w:rPr>
-      </w:pPr>
-      <w:r>
-        <w:rPr>
-          <w:lang w:val="en-IL"/>
-        </w:rPr>
+      </w:pPr>
+      <w:r>
         <w:t xml:space="preserve">Stroke ordering and optimization </w:t>
       </w:r>
     </w:p>
@@ -1047,14 +1409,8 @@
           <w:ilvl w:val="0"/>
           <w:numId w:val="3"/>
         </w:numPr>
-        <w:rPr>
-          <w:lang w:val="en-IL"/>
-        </w:rPr>
-      </w:pPr>
-      <w:r>
-        <w:rPr>
-          <w:lang w:val="en-IL"/>
-        </w:rPr>
+      </w:pPr>
+      <w:r>
         <w:t xml:space="preserve">Robotic arm control </w:t>
       </w:r>
     </w:p>
@@ -1064,14 +1420,8 @@
           <w:ilvl w:val="0"/>
           <w:numId w:val="3"/>
         </w:numPr>
-        <w:rPr>
-          <w:lang w:val="en-IL"/>
-        </w:rPr>
-      </w:pPr>
-      <w:r>
-        <w:rPr>
-          <w:lang w:val="en-IL"/>
-        </w:rPr>
+      </w:pPr>
+      <w:r>
         <w:t xml:space="preserve">Paper feeding, positioning, and cutting mechanisms </w:t>
       </w:r>
     </w:p>
@@ -1081,51 +1431,28 @@
           <w:ilvl w:val="0"/>
           <w:numId w:val="3"/>
         </w:numPr>
-        <w:rPr>
-          <w:lang w:val="en-IL"/>
-        </w:rPr>
-      </w:pPr>
-      <w:r>
-        <w:rPr>
-          <w:lang w:val="en-IL"/>
-        </w:rPr>
+      </w:pPr>
+      <w:r>
         <w:t xml:space="preserve">A web-based user interface </w:t>
       </w:r>
     </w:p>
     <w:p>
-      <w:pPr>
-        <w:rPr>
-          <w:lang w:val="en-IL"/>
-        </w:rPr>
-      </w:pPr>
-      <w:r>
-        <w:rPr>
-          <w:b/>
-          <w:bCs/>
-          <w:lang w:val="en-IL"/>
+      <w:r>
+        <w:rPr>
+          <w:b/>
+          <w:bCs/>
         </w:rPr>
         <w:t>Team members:</w:t>
       </w:r>
       <w:r>
-        <w:rPr>
-          <w:lang w:val="en-IL"/>
-        </w:rPr>
         <w:br/>
         <w:t>[Add names]</w:t>
       </w:r>
     </w:p>
     <w:p>
-      <w:pPr>
-        <w:rPr>
-          <w:lang w:val="en-IL"/>
-        </w:rPr>
-      </w:pPr>
-      <w:r>
-        <w:rPr>
-          <w:lang w:val="en-IL"/>
-        </w:rPr>
+      <w:r>
         <w:pict w14:anchorId="0218DB1B">
-          <v:rect id="_x0000_i1109" style="width:0;height:1.5pt" o:hralign="center" o:hrstd="t" o:hr="t" fillcolor="#a0a0a0" stroked="f"/>
+          <v:rect id="_x0000_i1025" style="width:0;height:1.5pt" o:hralign="center" o:hrstd="t" o:hr="t" fillcolor="#a0a0a0" stroked="f"/>
         </w:pict>
       </w:r>
     </w:p>
@@ -1134,41 +1461,23 @@
         <w:rPr>
           <w:b/>
           <w:bCs/>
-          <w:lang w:val="en-IL"/>
-        </w:rPr>
-      </w:pPr>
-      <w:r>
-        <w:rPr>
-          <w:b/>
-          <w:bCs/>
-          <w:lang w:val="en-IL"/>
+        </w:rPr>
+      </w:pPr>
+      <w:r>
+        <w:rPr>
+          <w:b/>
+          <w:bCs/>
         </w:rPr>
         <w:t>Slide 2 — The Original Problem</w:t>
       </w:r>
     </w:p>
     <w:p>
-      <w:pPr>
-        <w:rPr>
-          <w:lang w:val="en-IL"/>
-        </w:rPr>
-      </w:pPr>
-      <w:r>
-        <w:rPr>
-          <w:lang w:val="en-IL"/>
-        </w:rPr>
+      <w:r>
         <w:t>The original idea was to build a system in which a person stands in a designated location, gets photographed, and the robot creates a personalized drawing of that person.</w:t>
       </w:r>
     </w:p>
     <w:p>
-      <w:pPr>
-        <w:rPr>
-          <w:lang w:val="en-IL"/>
-        </w:rPr>
-      </w:pPr>
-      <w:r>
-        <w:rPr>
-          <w:lang w:val="en-IL"/>
-        </w:rPr>
+      <w:r>
         <w:t>After completing the drawing, the robot was originally planned to:</w:t>
       </w:r>
     </w:p>
@@ -1178,14 +1487,8 @@
           <w:ilvl w:val="0"/>
           <w:numId w:val="4"/>
         </w:numPr>
-        <w:rPr>
-          <w:lang w:val="en-IL"/>
-        </w:rPr>
-      </w:pPr>
-      <w:r>
-        <w:rPr>
-          <w:lang w:val="en-IL"/>
-        </w:rPr>
+      </w:pPr>
+      <w:r>
         <w:t xml:space="preserve">Draw the portrait. </w:t>
       </w:r>
     </w:p>
@@ -1195,14 +1498,8 @@
           <w:ilvl w:val="0"/>
           <w:numId w:val="4"/>
         </w:numPr>
-        <w:rPr>
-          <w:lang w:val="en-IL"/>
-        </w:rPr>
-      </w:pPr>
-      <w:r>
-        <w:rPr>
-          <w:lang w:val="en-IL"/>
-        </w:rPr>
+      </w:pPr>
+      <w:r>
         <w:t xml:space="preserve">Stamp it with a commemorative stamp. </w:t>
       </w:r>
     </w:p>
@@ -1212,14 +1509,8 @@
           <w:ilvl w:val="0"/>
           <w:numId w:val="4"/>
         </w:numPr>
-        <w:rPr>
-          <w:lang w:val="en-IL"/>
-        </w:rPr>
-      </w:pPr>
-      <w:r>
-        <w:rPr>
-          <w:lang w:val="en-IL"/>
-        </w:rPr>
+      </w:pPr>
+      <w:r>
         <w:t xml:space="preserve">Pick up the finished drawing. </w:t>
       </w:r>
     </w:p>
@@ -1229,42 +1520,20 @@
           <w:ilvl w:val="0"/>
           <w:numId w:val="4"/>
         </w:numPr>
-        <w:rPr>
-          <w:lang w:val="en-IL"/>
-        </w:rPr>
-      </w:pPr>
-      <w:r>
-        <w:rPr>
-          <w:lang w:val="en-IL"/>
-        </w:rPr>
+      </w:pPr>
+      <w:r>
         <w:t xml:space="preserve">Hand it directly to the user. </w:t>
       </w:r>
     </w:p>
     <w:p>
-      <w:pPr>
-        <w:rPr>
-          <w:lang w:val="en-IL"/>
-        </w:rPr>
-      </w:pPr>
-      <w:r>
-        <w:rPr>
-          <w:lang w:val="en-IL"/>
-        </w:rPr>
+      <w:r>
         <w:t>The entire process was intended to be automatic, from taking the photo to delivering the final product.</w:t>
       </w:r>
     </w:p>
     <w:p>
-      <w:pPr>
-        <w:rPr>
-          <w:lang w:val="en-IL"/>
-        </w:rPr>
-      </w:pPr>
-      <w:r>
-        <w:rPr>
-          <w:lang w:val="en-IL"/>
-        </w:rPr>
+      <w:r>
         <w:pict w14:anchorId="0E9A5F12">
-          <v:rect id="_x0000_i1110" style="width:0;height:1.5pt" o:hralign="center" o:hrstd="t" o:hr="t" fillcolor="#a0a0a0" stroked="f"/>
+          <v:rect id="_x0000_i1026" style="width:0;height:1.5pt" o:hralign="center" o:hrstd="t" o:hr="t" fillcolor="#a0a0a0" stroked="f"/>
         </w:pict>
       </w:r>
     </w:p>
@@ -1273,29 +1542,21 @@
         <w:rPr>
           <w:b/>
           <w:bCs/>
-          <w:lang w:val="en-IL"/>
-        </w:rPr>
-      </w:pPr>
-      <w:r>
-        <w:rPr>
-          <w:b/>
-          <w:bCs/>
-          <w:lang w:val="en-IL"/>
+        </w:rPr>
+      </w:pPr>
+      <w:r>
+        <w:rPr>
+          <w:b/>
+          <w:bCs/>
         </w:rPr>
         <w:t>Slide 3 — Original Planned Functionality</w:t>
       </w:r>
     </w:p>
     <w:p>
-      <w:pPr>
-        <w:rPr>
-          <w:lang w:val="en-IL"/>
-        </w:rPr>
-      </w:pPr>
-      <w:r>
-        <w:rPr>
-          <w:b/>
-          <w:bCs/>
-          <w:lang w:val="en-IL"/>
+      <w:r>
+        <w:rPr>
+          <w:b/>
+          <w:bCs/>
         </w:rPr>
         <w:t>Creating the Drawing</w:t>
       </w:r>
@@ -1306,14 +1567,8 @@
           <w:ilvl w:val="0"/>
           <w:numId w:val="5"/>
         </w:numPr>
-        <w:rPr>
-          <w:lang w:val="en-IL"/>
-        </w:rPr>
-      </w:pPr>
-      <w:r>
-        <w:rPr>
-          <w:lang w:val="en-IL"/>
-        </w:rPr>
+      </w:pPr>
+      <w:r>
         <w:t xml:space="preserve">Take a high-resolution picture of the subject. </w:t>
       </w:r>
     </w:p>
@@ -1323,14 +1578,8 @@
           <w:ilvl w:val="0"/>
           <w:numId w:val="5"/>
         </w:numPr>
-        <w:rPr>
-          <w:lang w:val="en-IL"/>
-        </w:rPr>
-      </w:pPr>
-      <w:r>
-        <w:rPr>
-          <w:lang w:val="en-IL"/>
-        </w:rPr>
+      </w:pPr>
+      <w:r>
         <w:lastRenderedPageBreak/>
         <w:t xml:space="preserve">Convert the image into drawable strokes. </w:t>
       </w:r>
@@ -1341,28 +1590,16 @@
           <w:ilvl w:val="0"/>
           <w:numId w:val="5"/>
         </w:numPr>
-        <w:rPr>
-          <w:lang w:val="en-IL"/>
-        </w:rPr>
-      </w:pPr>
-      <w:r>
-        <w:rPr>
-          <w:lang w:val="en-IL"/>
-        </w:rPr>
+      </w:pPr>
+      <w:r>
         <w:t xml:space="preserve">Choose an efficient order in which to draw the strokes. </w:t>
       </w:r>
     </w:p>
     <w:p>
-      <w:pPr>
-        <w:rPr>
-          <w:lang w:val="en-IL"/>
-        </w:rPr>
-      </w:pPr>
-      <w:r>
-        <w:rPr>
-          <w:b/>
-          <w:bCs/>
-          <w:lang w:val="en-IL"/>
+      <w:r>
+        <w:rPr>
+          <w:b/>
+          <w:bCs/>
         </w:rPr>
         <w:t>Drawing</w:t>
       </w:r>
@@ -1373,14 +1610,8 @@
           <w:ilvl w:val="0"/>
           <w:numId w:val="6"/>
         </w:numPr>
-        <w:rPr>
-          <w:lang w:val="en-IL"/>
-        </w:rPr>
-      </w:pPr>
-      <w:r>
-        <w:rPr>
-          <w:lang w:val="en-IL"/>
-        </w:rPr>
+      </w:pPr>
+      <w:r>
         <w:t xml:space="preserve">Pick up the marker. </w:t>
       </w:r>
     </w:p>
@@ -1390,14 +1621,8 @@
           <w:ilvl w:val="0"/>
           <w:numId w:val="6"/>
         </w:numPr>
-        <w:rPr>
-          <w:lang w:val="en-IL"/>
-        </w:rPr>
-      </w:pPr>
-      <w:r>
-        <w:rPr>
-          <w:lang w:val="en-IL"/>
-        </w:rPr>
+      </w:pPr>
+      <w:r>
         <w:t xml:space="preserve">Draw the strokes on the paper. </w:t>
       </w:r>
     </w:p>
@@ -1407,14 +1632,8 @@
           <w:ilvl w:val="0"/>
           <w:numId w:val="6"/>
         </w:numPr>
-        <w:rPr>
-          <w:lang w:val="en-IL"/>
-        </w:rPr>
-      </w:pPr>
-      <w:r>
-        <w:rPr>
-          <w:lang w:val="en-IL"/>
-        </w:rPr>
+      </w:pPr>
+      <w:r>
         <w:t xml:space="preserve">Return the marker. </w:t>
       </w:r>
     </w:p>
@@ -1424,14 +1643,8 @@
           <w:ilvl w:val="0"/>
           <w:numId w:val="6"/>
         </w:numPr>
-        <w:rPr>
-          <w:lang w:val="en-IL"/>
-        </w:rPr>
-      </w:pPr>
-      <w:r>
-        <w:rPr>
-          <w:lang w:val="en-IL"/>
-        </w:rPr>
+      </w:pPr>
+      <w:r>
         <w:t xml:space="preserve">Pick up the stamp. </w:t>
       </w:r>
     </w:p>
@@ -1441,14 +1654,8 @@
           <w:ilvl w:val="0"/>
           <w:numId w:val="6"/>
         </w:numPr>
-        <w:rPr>
-          <w:lang w:val="en-IL"/>
-        </w:rPr>
-      </w:pPr>
-      <w:r>
-        <w:rPr>
-          <w:lang w:val="en-IL"/>
-        </w:rPr>
+      </w:pPr>
+      <w:r>
         <w:t xml:space="preserve">Perform the stamping motion. </w:t>
       </w:r>
     </w:p>
@@ -1458,28 +1665,16 @@
           <w:ilvl w:val="0"/>
           <w:numId w:val="6"/>
         </w:numPr>
-        <w:rPr>
-          <w:lang w:val="en-IL"/>
-        </w:rPr>
-      </w:pPr>
-      <w:r>
-        <w:rPr>
-          <w:lang w:val="en-IL"/>
-        </w:rPr>
+      </w:pPr>
+      <w:r>
         <w:t xml:space="preserve">Return the stamp. </w:t>
       </w:r>
     </w:p>
     <w:p>
-      <w:pPr>
-        <w:rPr>
-          <w:lang w:val="en-IL"/>
-        </w:rPr>
-      </w:pPr>
-      <w:r>
-        <w:rPr>
-          <w:b/>
-          <w:bCs/>
-          <w:lang w:val="en-IL"/>
+      <w:r>
+        <w:rPr>
+          <w:b/>
+          <w:bCs/>
         </w:rPr>
         <w:t>Delivering the Drawing</w:t>
       </w:r>
@@ -1490,14 +1685,8 @@
           <w:ilvl w:val="0"/>
           <w:numId w:val="7"/>
         </w:numPr>
-        <w:rPr>
-          <w:lang w:val="en-IL"/>
-        </w:rPr>
-      </w:pPr>
-      <w:r>
-        <w:rPr>
-          <w:lang w:val="en-IL"/>
-        </w:rPr>
+      </w:pPr>
+      <w:r>
         <w:t xml:space="preserve">Pick up the finished page. </w:t>
       </w:r>
     </w:p>
@@ -1507,14 +1696,8 @@
           <w:ilvl w:val="0"/>
           <w:numId w:val="7"/>
         </w:numPr>
-        <w:rPr>
-          <w:lang w:val="en-IL"/>
-        </w:rPr>
-      </w:pPr>
-      <w:r>
-        <w:rPr>
-          <w:lang w:val="en-IL"/>
-        </w:rPr>
+      </w:pPr>
+      <w:r>
         <w:t xml:space="preserve">Move it to a designated delivery location. </w:t>
       </w:r>
     </w:p>
@@ -1524,29 +1707,15 @@
           <w:ilvl w:val="0"/>
           <w:numId w:val="7"/>
         </w:numPr>
-        <w:rPr>
-          <w:lang w:val="en-IL"/>
-        </w:rPr>
-      </w:pPr>
-      <w:r>
-        <w:rPr>
-          <w:lang w:val="en-IL"/>
-        </w:rPr>
+      </w:pPr>
+      <w:r>
         <w:t xml:space="preserve">Hand it directly to the user. </w:t>
       </w:r>
     </w:p>
     <w:p>
-      <w:pPr>
-        <w:rPr>
-          <w:lang w:val="en-IL"/>
-        </w:rPr>
-      </w:pPr>
-      <w:r>
-        <w:rPr>
-          <w:lang w:val="en-IL"/>
-        </w:rPr>
+      <w:r>
         <w:pict w14:anchorId="533DFB39">
-          <v:rect id="_x0000_i1111" style="width:0;height:1.5pt" o:hralign="center" o:hrstd="t" o:hr="t" fillcolor="#a0a0a0" stroked="f"/>
+          <v:rect id="_x0000_i1027" style="width:0;height:1.5pt" o:hralign="center" o:hrstd="t" o:hr="t" fillcolor="#a0a0a0" stroked="f"/>
         </w:pict>
       </w:r>
     </w:p>
@@ -1555,222 +1724,120 @@
         <w:rPr>
           <w:b/>
           <w:bCs/>
-          <w:lang w:val="en-IL"/>
-        </w:rPr>
-      </w:pPr>
-      <w:r>
-        <w:rPr>
-          <w:b/>
-          <w:bCs/>
-          <w:lang w:val="en-IL"/>
+        </w:rPr>
+      </w:pPr>
+      <w:r>
+        <w:rPr>
+          <w:b/>
+          <w:bCs/>
         </w:rPr>
         <w:t>Slide 4 — What Changed Compared to the Original Plan?</w:t>
       </w:r>
     </w:p>
     <w:p>
-      <w:pPr>
-        <w:rPr>
-          <w:lang w:val="en-IL"/>
-        </w:rPr>
-      </w:pPr>
-      <w:r>
-        <w:rPr>
-          <w:lang w:val="en-IL"/>
-        </w:rPr>
+      <w:r>
         <w:t>During development, we discovered that some of the solutions we originally planned were not suitable enough for the actual system.</w:t>
       </w:r>
     </w:p>
     <w:p>
-      <w:pPr>
-        <w:rPr>
-          <w:lang w:val="en-IL"/>
-        </w:rPr>
-      </w:pPr>
-      <w:r>
-        <w:rPr>
-          <w:lang w:val="en-IL"/>
-        </w:rPr>
+      <w:r>
         <w:t>This led us to make several significant changes.</w:t>
       </w:r>
     </w:p>
     <w:p>
-      <w:pPr>
-        <w:rPr>
-          <w:lang w:val="en-IL"/>
-        </w:rPr>
-      </w:pPr>
-      <w:r>
-        <w:rPr>
-          <w:b/>
-          <w:bCs/>
-          <w:lang w:val="en-IL"/>
+      <w:r>
+        <w:rPr>
+          <w:b/>
+          <w:bCs/>
         </w:rPr>
         <w:t>Image-to-drawing algorithm</w:t>
       </w:r>
     </w:p>
     <w:p>
-      <w:pPr>
-        <w:rPr>
-          <w:lang w:val="en-IL"/>
-        </w:rPr>
-      </w:pPr>
-      <w:r>
-        <w:rPr>
-          <w:lang w:val="en-IL"/>
-        </w:rPr>
+      <w:r>
         <w:t xml:space="preserve">Originally, we planned to use the existing </w:t>
       </w:r>
-      <w:r>
-        <w:rPr>
-          <w:b/>
-          <w:bCs/>
-          <w:lang w:val="en-IL"/>
+      <w:proofErr w:type="spellStart"/>
+      <w:r>
+        <w:rPr>
+          <w:b/>
+          <w:bCs/>
         </w:rPr>
         <w:t>SwiftSketch</w:t>
       </w:r>
-      <w:r>
-        <w:rPr>
-          <w:lang w:val="en-IL"/>
-        </w:rPr>
+      <w:proofErr w:type="spellEnd"/>
+      <w:r>
         <w:t xml:space="preserve"> algorithm to convert photographs into line drawings.</w:t>
       </w:r>
     </w:p>
     <w:p>
-      <w:pPr>
-        <w:rPr>
-          <w:lang w:val="en-IL"/>
-        </w:rPr>
-      </w:pPr>
-      <w:r>
-        <w:rPr>
-          <w:lang w:val="en-IL"/>
-        </w:rPr>
+      <w:r>
         <w:t>After testing it on portrait images, we found that its results were not accurate enough for our needs. Important facial features were often lost, and the resemblance between the generated sketch and the photographed person was not strong enough.</w:t>
       </w:r>
     </w:p>
     <w:p>
-      <w:pPr>
-        <w:rPr>
-          <w:lang w:val="en-IL"/>
-        </w:rPr>
-      </w:pPr>
-      <w:r>
-        <w:rPr>
-          <w:lang w:val="en-IL"/>
-        </w:rPr>
+      <w:r>
         <w:t xml:space="preserve">Because of this, we decided to move away from the ready-made solution and </w:t>
       </w:r>
       <w:r>
         <w:rPr>
           <w:b/>
           <w:bCs/>
-          <w:lang w:val="en-IL"/>
         </w:rPr>
         <w:t>train and adapt our own model specifically for portrait generation</w:t>
       </w:r>
       <w:r>
-        <w:rPr>
-          <w:lang w:val="en-IL"/>
-        </w:rPr>
         <w:t>.</w:t>
       </w:r>
     </w:p>
     <w:p>
-      <w:pPr>
-        <w:rPr>
-          <w:lang w:val="en-IL"/>
-        </w:rPr>
-      </w:pPr>
-      <w:r>
-        <w:rPr>
-          <w:b/>
-          <w:bCs/>
-          <w:lang w:val="en-IL"/>
+      <w:r>
+        <w:rPr>
+          <w:b/>
+          <w:bCs/>
         </w:rPr>
         <w:t>Paper handling</w:t>
       </w:r>
     </w:p>
     <w:p>
-      <w:pPr>
-        <w:rPr>
-          <w:lang w:val="en-IL"/>
-        </w:rPr>
-      </w:pPr>
-      <w:r>
-        <w:rPr>
-          <w:lang w:val="en-IL"/>
-        </w:rPr>
+      <w:r>
         <w:t xml:space="preserve">Instead of working with individual sheets of paper, we added a </w:t>
       </w:r>
       <w:r>
         <w:rPr>
           <w:b/>
           <w:bCs/>
-          <w:lang w:val="en-IL"/>
         </w:rPr>
         <w:t>continuous paper roll</w:t>
       </w:r>
       <w:r>
-        <w:rPr>
-          <w:lang w:val="en-IL"/>
-        </w:rPr>
         <w:t>, allowing the system to produce multiple portraits consecutively without requiring manual paper replacement.</w:t>
       </w:r>
     </w:p>
     <w:p>
-      <w:pPr>
-        <w:rPr>
-          <w:lang w:val="en-IL"/>
-        </w:rPr>
-      </w:pPr>
-      <w:r>
-        <w:rPr>
-          <w:b/>
-          <w:bCs/>
-          <w:lang w:val="en-IL"/>
+      <w:r>
+        <w:rPr>
+          <w:b/>
+          <w:bCs/>
         </w:rPr>
         <w:lastRenderedPageBreak/>
         <w:t>Delivering the portrait</w:t>
       </w:r>
     </w:p>
     <w:p>
-      <w:pPr>
-        <w:rPr>
-          <w:lang w:val="en-IL"/>
-        </w:rPr>
-      </w:pPr>
-      <w:r>
-        <w:rPr>
-          <w:lang w:val="en-IL"/>
-        </w:rPr>
+      <w:r>
         <w:t>We decided not to have the robot physically pick up the finished page and hand it directly to the user.</w:t>
       </w:r>
     </w:p>
     <w:p>
-      <w:pPr>
-        <w:rPr>
-          <w:lang w:val="en-IL"/>
-        </w:rPr>
-      </w:pPr>
-      <w:r>
-        <w:rPr>
-          <w:lang w:val="en-IL"/>
-        </w:rPr>
+      <w:r>
         <w:t>Instead, the system cuts the finished portrait from the paper roll so that it can be easily collected by the user.</w:t>
       </w:r>
     </w:p>
     <w:p>
-      <w:pPr>
-        <w:rPr>
-          <w:lang w:val="en-IL"/>
-        </w:rPr>
-      </w:pPr>
-      <w:r>
-        <w:rPr>
-          <w:lang w:val="en-IL"/>
-        </w:rPr>
+      <w:r>
         <w:pict w14:anchorId="0BDBA7B5">
-          <v:rect id="_x0000_i1112" style="width:0;height:1.5pt" o:hralign="center" o:hrstd="t" o:hr="t" fillcolor="#a0a0a0" stroked="f"/>
+          <v:rect id="_x0000_i1028" style="width:0;height:1.5pt" o:hralign="center" o:hrstd="t" o:hr="t" fillcolor="#a0a0a0" stroked="f"/>
         </w:pict>
       </w:r>
     </w:p>
@@ -1779,14 +1846,12 @@
         <w:rPr>
           <w:b/>
           <w:bCs/>
-          <w:lang w:val="en-IL"/>
-        </w:rPr>
-      </w:pPr>
-      <w:r>
-        <w:rPr>
-          <w:b/>
-          <w:bCs/>
-          <w:lang w:val="en-IL"/>
+        </w:rPr>
+      </w:pPr>
+      <w:r>
+        <w:rPr>
+          <w:b/>
+          <w:bCs/>
         </w:rPr>
         <w:t>Slide 5 — Technologies We Chose</w:t>
       </w:r>
@@ -1796,54 +1861,28 @@
         <w:rPr>
           <w:b/>
           <w:bCs/>
-          <w:lang w:val="en-IL"/>
-        </w:rPr>
-      </w:pPr>
-      <w:r>
-        <w:rPr>
-          <w:b/>
-          <w:bCs/>
-          <w:lang w:val="en-IL"/>
+        </w:rPr>
+      </w:pPr>
+      <w:r>
+        <w:rPr>
+          <w:b/>
+          <w:bCs/>
         </w:rPr>
         <w:t>Computer Vision &amp; Machine Learning</w:t>
       </w:r>
     </w:p>
     <w:p>
-      <w:pPr>
-        <w:rPr>
-          <w:lang w:val="en-IL"/>
-        </w:rPr>
-      </w:pPr>
-      <w:r>
-        <w:rPr>
-          <w:lang w:val="en-IL"/>
-        </w:rPr>
+      <w:r>
         <w:t>The system receives a photograph of the user and processes it before generating the drawing.</w:t>
       </w:r>
     </w:p>
     <w:p>
-      <w:pPr>
-        <w:rPr>
-          <w:lang w:val="en-IL"/>
-        </w:rPr>
-      </w:pPr>
-      <w:r>
-        <w:rPr>
-          <w:lang w:val="en-IL"/>
-        </w:rPr>
+      <w:r>
         <w:t>We chose to train our own model because the existing solution we tested did not provide sufficient accuracy for portrait drawings.</w:t>
       </w:r>
     </w:p>
     <w:p>
-      <w:pPr>
-        <w:rPr>
-          <w:lang w:val="en-IL"/>
-        </w:rPr>
-      </w:pPr>
-      <w:r>
-        <w:rPr>
-          <w:lang w:val="en-IL"/>
-        </w:rPr>
+      <w:r>
         <w:t>The goal of the model is to preserve the most important facial characteristics while representing the image using a limited set of drawable lines.</w:t>
       </w:r>
     </w:p>
@@ -1852,28 +1891,18 @@
         <w:rPr>
           <w:b/>
           <w:bCs/>
-          <w:lang w:val="en-IL"/>
-        </w:rPr>
-      </w:pPr>
-      <w:r>
-        <w:rPr>
-          <w:b/>
-          <w:bCs/>
-          <w:lang w:val="en-IL"/>
+        </w:rPr>
+      </w:pPr>
+      <w:r>
+        <w:rPr>
+          <w:b/>
+          <w:bCs/>
         </w:rPr>
         <w:t>Image Processing</w:t>
       </w:r>
     </w:p>
     <w:p>
-      <w:pPr>
-        <w:rPr>
-          <w:lang w:val="en-IL"/>
-        </w:rPr>
-      </w:pPr>
-      <w:r>
-        <w:rPr>
-          <w:lang w:val="en-IL"/>
-        </w:rPr>
+      <w:r>
         <w:t>Before the image is passed into the model, preprocessing is performed, including:</w:t>
       </w:r>
     </w:p>
@@ -1883,14 +1912,8 @@
           <w:ilvl w:val="0"/>
           <w:numId w:val="8"/>
         </w:numPr>
-        <w:rPr>
-          <w:lang w:val="en-IL"/>
-        </w:rPr>
-      </w:pPr>
-      <w:r>
-        <w:rPr>
-          <w:lang w:val="en-IL"/>
-        </w:rPr>
+      </w:pPr>
+      <w:r>
         <w:t xml:space="preserve">Noise removal </w:t>
       </w:r>
     </w:p>
@@ -1900,14 +1923,8 @@
           <w:ilvl w:val="0"/>
           <w:numId w:val="8"/>
         </w:numPr>
-        <w:rPr>
-          <w:lang w:val="en-IL"/>
-        </w:rPr>
-      </w:pPr>
-      <w:r>
-        <w:rPr>
-          <w:lang w:val="en-IL"/>
-        </w:rPr>
+      </w:pPr>
+      <w:r>
         <w:t xml:space="preserve">Image resizing and normalization </w:t>
       </w:r>
     </w:p>
@@ -1917,14 +1934,8 @@
           <w:ilvl w:val="0"/>
           <w:numId w:val="8"/>
         </w:numPr>
-        <w:rPr>
-          <w:lang w:val="en-IL"/>
-        </w:rPr>
-      </w:pPr>
-      <w:r>
-        <w:rPr>
-          <w:lang w:val="en-IL"/>
-        </w:rPr>
+      </w:pPr>
+      <w:r>
         <w:t xml:space="preserve">Highlighting important visual features </w:t>
       </w:r>
     </w:p>
@@ -1934,14 +1945,8 @@
           <w:ilvl w:val="0"/>
           <w:numId w:val="8"/>
         </w:numPr>
-        <w:rPr>
-          <w:lang w:val="en-IL"/>
-        </w:rPr>
-      </w:pPr>
-      <w:r>
-        <w:rPr>
-          <w:lang w:val="en-IL"/>
-        </w:rPr>
+      </w:pPr>
+      <w:r>
         <w:t xml:space="preserve">Removing unnecessary visual information </w:t>
       </w:r>
     </w:p>
@@ -1950,28 +1955,18 @@
         <w:rPr>
           <w:b/>
           <w:bCs/>
-          <w:lang w:val="en-IL"/>
-        </w:rPr>
-      </w:pPr>
-      <w:r>
-        <w:rPr>
-          <w:b/>
-          <w:bCs/>
-          <w:lang w:val="en-IL"/>
+        </w:rPr>
+      </w:pPr>
+      <w:r>
+        <w:rPr>
+          <w:b/>
+          <w:bCs/>
         </w:rPr>
         <w:t>Robotics</w:t>
       </w:r>
     </w:p>
     <w:p>
-      <w:pPr>
-        <w:rPr>
-          <w:lang w:val="en-IL"/>
-        </w:rPr>
-      </w:pPr>
-      <w:r>
-        <w:rPr>
-          <w:lang w:val="en-IL"/>
-        </w:rPr>
+      <w:r>
         <w:t>The robotic arm performs several different physical operations:</w:t>
       </w:r>
     </w:p>
@@ -1981,14 +1976,8 @@
           <w:ilvl w:val="0"/>
           <w:numId w:val="9"/>
         </w:numPr>
-        <w:rPr>
-          <w:lang w:val="en-IL"/>
-        </w:rPr>
-      </w:pPr>
-      <w:r>
-        <w:rPr>
-          <w:lang w:val="en-IL"/>
-        </w:rPr>
+      </w:pPr>
+      <w:r>
         <w:t xml:space="preserve">Using the marker </w:t>
       </w:r>
     </w:p>
@@ -1998,14 +1987,8 @@
           <w:ilvl w:val="0"/>
           <w:numId w:val="9"/>
         </w:numPr>
-        <w:rPr>
-          <w:lang w:val="en-IL"/>
-        </w:rPr>
-      </w:pPr>
-      <w:r>
-        <w:rPr>
-          <w:lang w:val="en-IL"/>
-        </w:rPr>
+      </w:pPr>
+      <w:r>
         <w:t xml:space="preserve">Operating the magnetic paper holders </w:t>
       </w:r>
     </w:p>
@@ -2015,14 +1998,8 @@
           <w:ilvl w:val="0"/>
           <w:numId w:val="9"/>
         </w:numPr>
-        <w:rPr>
-          <w:lang w:val="en-IL"/>
-        </w:rPr>
-      </w:pPr>
-      <w:r>
-        <w:rPr>
-          <w:lang w:val="en-IL"/>
-        </w:rPr>
+      </w:pPr>
+      <w:r>
         <w:t xml:space="preserve">Using the cutting tool </w:t>
       </w:r>
     </w:p>
@@ -2032,14 +2009,8 @@
           <w:ilvl w:val="0"/>
           <w:numId w:val="9"/>
         </w:numPr>
-        <w:rPr>
-          <w:lang w:val="en-IL"/>
-        </w:rPr>
-      </w:pPr>
-      <w:r>
-        <w:rPr>
-          <w:lang w:val="en-IL"/>
-        </w:rPr>
+      </w:pPr>
+      <w:r>
         <w:t xml:space="preserve">Returning each tool to its designated location </w:t>
       </w:r>
     </w:p>
@@ -2049,29 +2020,15 @@
           <w:ilvl w:val="0"/>
           <w:numId w:val="9"/>
         </w:numPr>
-        <w:rPr>
-          <w:lang w:val="en-IL"/>
-        </w:rPr>
-      </w:pPr>
-      <w:r>
-        <w:rPr>
-          <w:lang w:val="en-IL"/>
-        </w:rPr>
+      </w:pPr>
+      <w:r>
         <w:t xml:space="preserve">[Stamping, if still included in the final version] </w:t>
       </w:r>
     </w:p>
     <w:p>
-      <w:pPr>
-        <w:rPr>
-          <w:lang w:val="en-IL"/>
-        </w:rPr>
-      </w:pPr>
-      <w:r>
-        <w:rPr>
-          <w:lang w:val="en-IL"/>
-        </w:rPr>
+      <w:r>
         <w:pict w14:anchorId="04BD70BF">
-          <v:rect id="_x0000_i1113" style="width:0;height:1.5pt" o:hralign="center" o:hrstd="t" o:hr="t" fillcolor="#a0a0a0" stroked="f"/>
+          <v:rect id="_x0000_i1029" style="width:0;height:1.5pt" o:hralign="center" o:hrstd="t" o:hr="t" fillcolor="#a0a0a0" stroked="f"/>
         </w:pict>
       </w:r>
     </w:p>
@@ -2080,112 +2037,66 @@
         <w:rPr>
           <w:b/>
           <w:bCs/>
-          <w:lang w:val="en-IL"/>
-        </w:rPr>
-      </w:pPr>
-      <w:r>
-        <w:rPr>
-          <w:b/>
-          <w:bCs/>
-          <w:lang w:val="en-IL"/>
+        </w:rPr>
+      </w:pPr>
+      <w:r>
+        <w:rPr>
+          <w:b/>
+          <w:bCs/>
         </w:rPr>
         <w:t>Slide 6 — The Algorithm: From Image to Drawing</w:t>
       </w:r>
     </w:p>
     <w:p>
-      <w:pPr>
-        <w:rPr>
-          <w:lang w:val="en-IL"/>
-        </w:rPr>
-      </w:pPr>
-      <w:r>
-        <w:rPr>
-          <w:lang w:val="en-IL"/>
-        </w:rPr>
+      <w:r>
         <w:lastRenderedPageBreak/>
         <w:t>The algorithm receives the image approved by the user and converts it into a path that the robot can physically execute.</w:t>
       </w:r>
     </w:p>
     <w:p>
-      <w:pPr>
-        <w:rPr>
-          <w:lang w:val="en-IL"/>
-        </w:rPr>
-      </w:pPr>
-      <w:r>
-        <w:rPr>
-          <w:b/>
-          <w:bCs/>
-          <w:lang w:val="en-IL"/>
+      <w:r>
+        <w:rPr>
+          <w:b/>
+          <w:bCs/>
         </w:rPr>
         <w:t>Step 1 — Preprocessing</w:t>
       </w:r>
     </w:p>
     <w:p>
-      <w:pPr>
-        <w:rPr>
-          <w:lang w:val="en-IL"/>
-        </w:rPr>
-      </w:pPr>
-      <w:r>
-        <w:rPr>
-          <w:lang w:val="en-IL"/>
-        </w:rPr>
+      <w:r>
         <w:t>The image is cleaned and processed to remove unnecessary noise and preserve the facial details that are most important for the portrait.</w:t>
       </w:r>
     </w:p>
     <w:p>
-      <w:pPr>
-        <w:rPr>
-          <w:lang w:val="en-IL"/>
-        </w:rPr>
-      </w:pPr>
-      <w:r>
-        <w:rPr>
-          <w:b/>
-          <w:bCs/>
-          <w:lang w:val="en-IL"/>
+      <w:r>
+        <w:rPr>
+          <w:b/>
+          <w:bCs/>
         </w:rPr>
         <w:t>Step 2 — Image-to-Strokes Conversion</w:t>
       </w:r>
     </w:p>
     <w:p>
-      <w:pPr>
-        <w:rPr>
-          <w:lang w:val="en-IL"/>
-        </w:rPr>
-      </w:pPr>
-      <w:r>
-        <w:rPr>
-          <w:lang w:val="en-IL"/>
-        </w:rPr>
+      <w:r>
         <w:t>The processed image is passed through the model we trained.</w:t>
       </w:r>
     </w:p>
     <w:p>
-      <w:pPr>
-        <w:rPr>
-          <w:lang w:val="en-IL"/>
-        </w:rPr>
-      </w:pPr>
-      <w:r>
-        <w:rPr>
-          <w:lang w:val="en-IL"/>
-        </w:rPr>
+      <w:r>
         <w:t>The model converts the image into a collection of strokes representing the main facial features.</w:t>
       </w:r>
     </w:p>
     <w:p>
-      <w:pPr>
-        <w:rPr>
-          <w:lang w:val="en-IL"/>
-        </w:rPr>
-      </w:pPr>
-      <w:r>
-        <w:rPr>
-          <w:lang w:val="en-IL"/>
-        </w:rPr>
-        <w:t>During development, we performed multiple training and testing iterations in order to improve:</w:t>
+      <w:r>
+        <w:t xml:space="preserve">During development, we performed multiple training and testing iterations </w:t>
+      </w:r>
+      <w:proofErr w:type="gramStart"/>
+      <w:r>
+        <w:t>in order to</w:t>
+      </w:r>
+      <w:proofErr w:type="gramEnd"/>
+      <w:r>
+        <w:t xml:space="preserve"> improve:</w:t>
       </w:r>
     </w:p>
     <w:p>
@@ -2194,14 +2105,8 @@
           <w:ilvl w:val="0"/>
           <w:numId w:val="10"/>
         </w:numPr>
-        <w:rPr>
-          <w:lang w:val="en-IL"/>
-        </w:rPr>
-      </w:pPr>
-      <w:r>
-        <w:rPr>
-          <w:lang w:val="en-IL"/>
-        </w:rPr>
+      </w:pPr>
+      <w:r>
         <w:t xml:space="preserve">Similarity to the original image </w:t>
       </w:r>
     </w:p>
@@ -2211,14 +2116,8 @@
           <w:ilvl w:val="0"/>
           <w:numId w:val="10"/>
         </w:numPr>
-        <w:rPr>
-          <w:lang w:val="en-IL"/>
-        </w:rPr>
-      </w:pPr>
-      <w:r>
-        <w:rPr>
-          <w:lang w:val="en-IL"/>
-        </w:rPr>
+      </w:pPr>
+      <w:r>
         <w:t xml:space="preserve">Facial feature preservation </w:t>
       </w:r>
     </w:p>
@@ -2228,14 +2127,8 @@
           <w:ilvl w:val="0"/>
           <w:numId w:val="10"/>
         </w:numPr>
-        <w:rPr>
-          <w:lang w:val="en-IL"/>
-        </w:rPr>
-      </w:pPr>
-      <w:r>
-        <w:rPr>
-          <w:lang w:val="en-IL"/>
-        </w:rPr>
+      </w:pPr>
+      <w:r>
         <w:t xml:space="preserve">Stroke quality </w:t>
       </w:r>
     </w:p>
@@ -2245,42 +2138,22 @@
           <w:ilvl w:val="0"/>
           <w:numId w:val="10"/>
         </w:numPr>
-        <w:rPr>
-          <w:lang w:val="en-IL"/>
-        </w:rPr>
-      </w:pPr>
-      <w:r>
-        <w:rPr>
-          <w:lang w:val="en-IL"/>
-        </w:rPr>
+      </w:pPr>
+      <w:r>
         <w:t xml:space="preserve">Drawability by the robotic system </w:t>
       </w:r>
     </w:p>
     <w:p>
-      <w:pPr>
-        <w:rPr>
-          <w:lang w:val="en-IL"/>
-        </w:rPr>
-      </w:pPr>
-      <w:r>
-        <w:rPr>
-          <w:b/>
-          <w:bCs/>
-          <w:lang w:val="en-IL"/>
+      <w:r>
+        <w:rPr>
+          <w:b/>
+          <w:bCs/>
         </w:rPr>
         <w:t>Step 3 — Post-Processing</w:t>
       </w:r>
     </w:p>
     <w:p>
-      <w:pPr>
-        <w:rPr>
-          <w:lang w:val="en-IL"/>
-        </w:rPr>
-      </w:pPr>
-      <w:r>
-        <w:rPr>
-          <w:lang w:val="en-IL"/>
-        </w:rPr>
+      <w:r>
         <w:t>After the strokes are generated, additional processing is performed:</w:t>
       </w:r>
     </w:p>
@@ -2290,14 +2163,8 @@
           <w:ilvl w:val="0"/>
           <w:numId w:val="11"/>
         </w:numPr>
-        <w:rPr>
-          <w:lang w:val="en-IL"/>
-        </w:rPr>
-      </w:pPr>
-      <w:r>
-        <w:rPr>
-          <w:lang w:val="en-IL"/>
-        </w:rPr>
+      </w:pPr>
+      <w:r>
         <w:t xml:space="preserve">Connecting nearby line segments </w:t>
       </w:r>
     </w:p>
@@ -2307,14 +2174,8 @@
           <w:ilvl w:val="0"/>
           <w:numId w:val="11"/>
         </w:numPr>
-        <w:rPr>
-          <w:lang w:val="en-IL"/>
-        </w:rPr>
-      </w:pPr>
-      <w:r>
-        <w:rPr>
-          <w:lang w:val="en-IL"/>
-        </w:rPr>
+      </w:pPr>
+      <w:r>
         <w:t xml:space="preserve">Removing very short or unnecessary strokes </w:t>
       </w:r>
     </w:p>
@@ -2324,14 +2185,8 @@
           <w:ilvl w:val="0"/>
           <w:numId w:val="11"/>
         </w:numPr>
-        <w:rPr>
-          <w:lang w:val="en-IL"/>
-        </w:rPr>
-      </w:pPr>
-      <w:r>
-        <w:rPr>
-          <w:lang w:val="en-IL"/>
-        </w:rPr>
+      </w:pPr>
+      <w:r>
         <w:t xml:space="preserve">Simplifying complex paths </w:t>
       </w:r>
     </w:p>
@@ -2341,29 +2196,15 @@
           <w:ilvl w:val="0"/>
           <w:numId w:val="11"/>
         </w:numPr>
-        <w:rPr>
-          <w:lang w:val="en-IL"/>
-        </w:rPr>
-      </w:pPr>
-      <w:r>
-        <w:rPr>
-          <w:lang w:val="en-IL"/>
-        </w:rPr>
+      </w:pPr>
+      <w:r>
         <w:t xml:space="preserve">Adjusting the output to the physical limitations of the robot </w:t>
       </w:r>
     </w:p>
     <w:p>
-      <w:pPr>
-        <w:rPr>
-          <w:lang w:val="en-IL"/>
-        </w:rPr>
-      </w:pPr>
-      <w:r>
-        <w:rPr>
-          <w:lang w:val="en-IL"/>
-        </w:rPr>
+      <w:r>
         <w:pict w14:anchorId="729B0662">
-          <v:rect id="_x0000_i1114" style="width:0;height:1.5pt" o:hralign="center" o:hrstd="t" o:hr="t" fillcolor="#a0a0a0" stroked="f"/>
+          <v:rect id="_x0000_i1030" style="width:0;height:1.5pt" o:hralign="center" o:hrstd="t" o:hr="t" fillcolor="#a0a0a0" stroked="f"/>
         </w:pict>
       </w:r>
     </w:p>
@@ -2372,28 +2213,18 @@
         <w:rPr>
           <w:b/>
           <w:bCs/>
-          <w:lang w:val="en-IL"/>
-        </w:rPr>
-      </w:pPr>
-      <w:r>
-        <w:rPr>
-          <w:b/>
-          <w:bCs/>
-          <w:lang w:val="en-IL"/>
+        </w:rPr>
+      </w:pPr>
+      <w:r>
+        <w:rPr>
+          <w:b/>
+          <w:bCs/>
         </w:rPr>
         <w:t>Slide 7 — Final Product: User Experience</w:t>
       </w:r>
     </w:p>
     <w:p>
-      <w:pPr>
-        <w:rPr>
-          <w:lang w:val="en-IL"/>
-        </w:rPr>
-      </w:pPr>
-      <w:r>
-        <w:rPr>
-          <w:lang w:val="en-IL"/>
-        </w:rPr>
+      <w:r>
         <w:t>The process begins through the system's website.</w:t>
       </w:r>
     </w:p>
@@ -2403,14 +2234,8 @@
           <w:ilvl w:val="0"/>
           <w:numId w:val="13"/>
         </w:numPr>
-        <w:rPr>
-          <w:lang w:val="en-IL"/>
-        </w:rPr>
-      </w:pPr>
-      <w:r>
-        <w:rPr>
-          <w:lang w:val="en-IL"/>
-        </w:rPr>
+      </w:pPr>
+      <w:r>
         <w:t xml:space="preserve">The user enters the website by scanning a QR code. </w:t>
       </w:r>
     </w:p>
@@ -2420,14 +2245,8 @@
           <w:ilvl w:val="0"/>
           <w:numId w:val="13"/>
         </w:numPr>
-        <w:rPr>
-          <w:lang w:val="en-IL"/>
-        </w:rPr>
-      </w:pPr>
-      <w:r>
-        <w:rPr>
-          <w:lang w:val="en-IL"/>
-        </w:rPr>
+      </w:pPr>
+      <w:r>
         <w:t xml:space="preserve">The user takes a photo. </w:t>
       </w:r>
     </w:p>
@@ -2437,14 +2256,8 @@
           <w:ilvl w:val="0"/>
           <w:numId w:val="13"/>
         </w:numPr>
-        <w:rPr>
-          <w:lang w:val="en-IL"/>
-        </w:rPr>
-      </w:pPr>
-      <w:r>
-        <w:rPr>
-          <w:lang w:val="en-IL"/>
-        </w:rPr>
+      </w:pPr>
+      <w:r>
         <w:t xml:space="preserve">The image is sent to the drawing-generation algorithm. </w:t>
       </w:r>
     </w:p>
@@ -2454,28 +2267,18 @@
           <w:ilvl w:val="0"/>
           <w:numId w:val="13"/>
         </w:numPr>
-        <w:rPr>
-          <w:lang w:val="en-IL"/>
-        </w:rPr>
-      </w:pPr>
-      <w:r>
-        <w:rPr>
-          <w:lang w:val="en-IL"/>
-        </w:rPr>
+      </w:pPr>
+      <w:r>
         <w:t xml:space="preserve">The user receives a </w:t>
       </w:r>
       <w:r>
         <w:rPr>
           <w:b/>
           <w:bCs/>
-          <w:lang w:val="en-IL"/>
         </w:rPr>
         <w:t>preview of the generated sketch</w:t>
       </w:r>
       <w:r>
-        <w:rPr>
-          <w:lang w:val="en-IL"/>
-        </w:rPr>
         <w:t xml:space="preserve">. </w:t>
       </w:r>
     </w:p>
@@ -2485,14 +2288,8 @@
           <w:ilvl w:val="0"/>
           <w:numId w:val="13"/>
         </w:numPr>
-        <w:rPr>
-          <w:lang w:val="en-IL"/>
-        </w:rPr>
-      </w:pPr>
-      <w:r>
-        <w:rPr>
-          <w:lang w:val="en-IL"/>
-        </w:rPr>
+      </w:pPr>
+      <w:r>
         <w:t xml:space="preserve">The user approves the sketch. </w:t>
       </w:r>
     </w:p>
@@ -2502,16 +2299,18 @@
           <w:ilvl w:val="0"/>
           <w:numId w:val="13"/>
         </w:numPr>
-        <w:rPr>
-          <w:lang w:val="en-IL"/>
-        </w:rPr>
-      </w:pPr>
-      <w:r>
-        <w:rPr>
-          <w:lang w:val="en-IL"/>
-        </w:rPr>
+      </w:pPr>
+      <w:r>
         <w:lastRenderedPageBreak/>
-        <w:t xml:space="preserve">The portrait data is sent to the PortraTron. </w:t>
+        <w:t xml:space="preserve">The portrait data is sent to the </w:t>
+      </w:r>
+      <w:proofErr w:type="spellStart"/>
+      <w:r>
+        <w:t>PortraTron</w:t>
+      </w:r>
+      <w:proofErr w:type="spellEnd"/>
+      <w:r>
+        <w:t xml:space="preserve">. </w:t>
       </w:r>
     </w:p>
     <w:p>
@@ -2520,42 +2319,20 @@
           <w:ilvl w:val="0"/>
           <w:numId w:val="13"/>
         </w:numPr>
-        <w:rPr>
-          <w:lang w:val="en-IL"/>
-        </w:rPr>
-      </w:pPr>
-      <w:r>
-        <w:rPr>
-          <w:lang w:val="en-IL"/>
-        </w:rPr>
+      </w:pPr>
+      <w:r>
         <w:t xml:space="preserve">The robot begins producing the physical drawing. </w:t>
       </w:r>
     </w:p>
     <w:p>
-      <w:pPr>
-        <w:rPr>
-          <w:lang w:val="en-IL"/>
-        </w:rPr>
-      </w:pPr>
-      <w:r>
-        <w:rPr>
-          <w:lang w:val="en-IL"/>
-        </w:rPr>
+      <w:r>
         <w:t>This allows the user to see how the portrait will look before the robot begins drawing it.</w:t>
       </w:r>
     </w:p>
     <w:p>
-      <w:pPr>
-        <w:rPr>
-          <w:lang w:val="en-IL"/>
-        </w:rPr>
-      </w:pPr>
-      <w:r>
-        <w:rPr>
-          <w:lang w:val="en-IL"/>
-        </w:rPr>
+      <w:r>
         <w:pict w14:anchorId="4050C3E1">
-          <v:rect id="_x0000_i1115" style="width:0;height:1.5pt" o:hralign="center" o:hrstd="t" o:hr="t" fillcolor="#a0a0a0" stroked="f"/>
+          <v:rect id="_x0000_i1031" style="width:0;height:1.5pt" o:hralign="center" o:hrstd="t" o:hr="t" fillcolor="#a0a0a0" stroked="f"/>
         </w:pict>
       </w:r>
     </w:p>
@@ -2564,124 +2341,97 @@
         <w:rPr>
           <w:b/>
           <w:bCs/>
-          <w:lang w:val="en-IL"/>
-        </w:rPr>
-      </w:pPr>
-      <w:r>
-        <w:rPr>
-          <w:b/>
-          <w:bCs/>
-          <w:lang w:val="en-IL"/>
-        </w:rPr>
-        <w:t>Slide 8 — Final Product: How PortraTron Works</w:t>
-      </w:r>
-    </w:p>
-    <w:p>
-      <w:pPr>
-        <w:rPr>
-          <w:b/>
-          <w:bCs/>
-          <w:lang w:val="en-IL"/>
-        </w:rPr>
-      </w:pPr>
-    </w:p>
-    <w:p>
-      <w:pPr>
+        </w:rPr>
+      </w:pPr>
+      <w:r>
+        <w:rPr>
+          <w:b/>
+          <w:bCs/>
+        </w:rPr>
+        <w:t xml:space="preserve">Slide 8 — Final Product: How </w:t>
+      </w:r>
+      <w:proofErr w:type="spellStart"/>
+      <w:r>
+        <w:rPr>
+          <w:b/>
+          <w:bCs/>
+        </w:rPr>
+        <w:t>PortraTron</w:t>
+      </w:r>
+      <w:proofErr w:type="spellEnd"/>
+      <w:r>
+        <w:rPr>
+          <w:b/>
+          <w:bCs/>
+        </w:rPr>
+        <w:t xml:space="preserve"> Works</w:t>
+      </w:r>
+    </w:p>
+    <w:p>
+      <w:pPr>
+        <w:rPr>
+          <w:b/>
+          <w:bCs/>
+        </w:rPr>
+      </w:pPr>
+    </w:p>
+    <w:p>
+      <w:pPr>
+        <w:rPr>
+          <w:b/>
+          <w:bCs/>
+          <w:rtl/>
+        </w:rPr>
+      </w:pPr>
+      <w:r>
         <w:rPr>
           <w:rFonts w:hint="cs"/>
           <w:b/>
           <w:bCs/>
           <w:rtl/>
-          <w:lang w:val="en-IL"/>
-        </w:rPr>
-      </w:pPr>
+        </w:rPr>
+        <w:t>חסר פה ק</w:t>
+      </w:r>
       <w:r>
         <w:rPr>
           <w:rFonts w:hint="cs"/>
           <w:b/>
           <w:bCs/>
           <w:rtl/>
-          <w:lang w:val="en-IL"/>
-        </w:rPr>
-        <w:t>חסר פה ק</w:t>
-      </w:r>
-      <w:r>
-        <w:rPr>
-          <w:rFonts w:hint="cs"/>
-          <w:b/>
-          <w:bCs/>
-          <w:rtl/>
-          <w:lang w:val="en-IL"/>
         </w:rPr>
         <w:t>צת על החותמת</w:t>
       </w:r>
     </w:p>
     <w:p>
-      <w:pPr>
-        <w:rPr>
-          <w:lang w:val="en-IL"/>
-        </w:rPr>
-      </w:pPr>
-      <w:r>
-        <w:rPr>
-          <w:lang w:val="en-IL"/>
-        </w:rPr>
+      <w:r>
         <w:t>After the approved drawing reaches the robotic system:</w:t>
       </w:r>
     </w:p>
     <w:p>
-      <w:pPr>
-        <w:rPr>
-          <w:lang w:val="en-IL"/>
-        </w:rPr>
-      </w:pPr>
-      <w:r>
-        <w:rPr>
-          <w:b/>
-          <w:bCs/>
-          <w:lang w:val="en-IL"/>
+      <w:r>
+        <w:rPr>
+          <w:b/>
+          <w:bCs/>
         </w:rPr>
         <w:t>1. Prepare the paper</w:t>
       </w:r>
     </w:p>
     <w:p>
-      <w:pPr>
-        <w:rPr>
-          <w:lang w:val="en-IL"/>
-        </w:rPr>
-      </w:pPr>
-      <w:r>
-        <w:rPr>
-          <w:lang w:val="en-IL"/>
-        </w:rPr>
+      <w:r>
         <w:t>The system pulls a new section of paper from the paper roll.</w:t>
       </w:r>
     </w:p>
     <w:p>
-      <w:pPr>
-        <w:rPr>
-          <w:lang w:val="en-IL"/>
-        </w:rPr>
-      </w:pPr>
-      <w:r>
-        <w:rPr>
-          <w:b/>
-          <w:bCs/>
-          <w:lang w:val="en-IL"/>
+      <w:r>
+        <w:rPr>
+          <w:b/>
+          <w:bCs/>
         </w:rPr>
         <w:t>2. Align and secure the paper</w:t>
       </w:r>
     </w:p>
     <w:p>
-      <w:pPr>
-        <w:rPr>
-          <w:lang w:val="en-IL"/>
-        </w:rPr>
-      </w:pPr>
-      <w:r>
-        <w:rPr>
-          <w:lang w:val="en-IL"/>
-        </w:rPr>
+      <w:r>
         <w:t>The robot uses two magnets:</w:t>
       </w:r>
     </w:p>
@@ -2691,14 +2441,8 @@
           <w:ilvl w:val="0"/>
           <w:numId w:val="14"/>
         </w:numPr>
-        <w:rPr>
-          <w:lang w:val="en-IL"/>
-        </w:rPr>
-      </w:pPr>
-      <w:r>
-        <w:rPr>
-          <w:lang w:val="en-IL"/>
-        </w:rPr>
+      </w:pPr>
+      <w:r>
         <w:t xml:space="preserve">One magnet holds the lower part of the paper. </w:t>
       </w:r>
     </w:p>
@@ -2708,55 +2452,27 @@
           <w:ilvl w:val="0"/>
           <w:numId w:val="14"/>
         </w:numPr>
-        <w:rPr>
-          <w:lang w:val="en-IL"/>
-        </w:rPr>
-      </w:pPr>
-      <w:r>
-        <w:rPr>
-          <w:lang w:val="en-IL"/>
-        </w:rPr>
+      </w:pPr>
+      <w:r>
         <w:t xml:space="preserve">A second magnet holds the upper part. </w:t>
       </w:r>
     </w:p>
     <w:p>
-      <w:pPr>
-        <w:rPr>
-          <w:lang w:val="en-IL"/>
-        </w:rPr>
-      </w:pPr>
-      <w:r>
-        <w:rPr>
-          <w:lang w:val="en-IL"/>
-        </w:rPr>
+      <w:r>
         <w:t>The magnets keep the paper straight and stable during the drawing process.</w:t>
       </w:r>
     </w:p>
     <w:p>
-      <w:pPr>
-        <w:rPr>
-          <w:lang w:val="en-IL"/>
-        </w:rPr>
-      </w:pPr>
-      <w:r>
-        <w:rPr>
-          <w:b/>
-          <w:bCs/>
-          <w:lang w:val="en-IL"/>
+      <w:r>
+        <w:rPr>
+          <w:b/>
+          <w:bCs/>
         </w:rPr>
         <w:t>3. Draw the portrait</w:t>
       </w:r>
     </w:p>
     <w:p>
-      <w:pPr>
-        <w:rPr>
-          <w:lang w:val="en-IL"/>
-        </w:rPr>
-      </w:pPr>
-      <w:r>
-        <w:rPr>
-          <w:lang w:val="en-IL"/>
-        </w:rPr>
+      <w:r>
         <w:t>The robot:</w:t>
       </w:r>
     </w:p>
@@ -2766,14 +2482,8 @@
           <w:ilvl w:val="0"/>
           <w:numId w:val="15"/>
         </w:numPr>
-        <w:rPr>
-          <w:lang w:val="en-IL"/>
-        </w:rPr>
-      </w:pPr>
-      <w:r>
-        <w:rPr>
-          <w:lang w:val="en-IL"/>
-        </w:rPr>
+      </w:pPr>
+      <w:r>
         <w:t xml:space="preserve">Picks up the marker. </w:t>
       </w:r>
     </w:p>
@@ -2783,14 +2493,8 @@
           <w:ilvl w:val="0"/>
           <w:numId w:val="15"/>
         </w:numPr>
-        <w:rPr>
-          <w:lang w:val="en-IL"/>
-        </w:rPr>
-      </w:pPr>
-      <w:r>
-        <w:rPr>
-          <w:lang w:val="en-IL"/>
-        </w:rPr>
+      </w:pPr>
+      <w:r>
         <w:t xml:space="preserve">Executes the generated stroke path. </w:t>
       </w:r>
     </w:p>
@@ -2800,113 +2504,66 @@
           <w:ilvl w:val="0"/>
           <w:numId w:val="15"/>
         </w:numPr>
-        <w:rPr>
-          <w:lang w:val="en-IL"/>
-        </w:rPr>
-      </w:pPr>
-      <w:r>
-        <w:rPr>
-          <w:lang w:val="en-IL"/>
-        </w:rPr>
+      </w:pPr>
+      <w:r>
         <w:t xml:space="preserve">Returns the marker to its original location. </w:t>
       </w:r>
     </w:p>
     <w:p>
-      <w:pPr>
-        <w:rPr>
-          <w:lang w:val="en-IL"/>
-        </w:rPr>
-      </w:pPr>
-      <w:r>
-        <w:rPr>
-          <w:b/>
-          <w:bCs/>
-          <w:lang w:val="en-IL"/>
+      <w:r>
+        <w:rPr>
+          <w:b/>
+          <w:bCs/>
         </w:rPr>
         <w:t>4. Release the paper</w:t>
       </w:r>
     </w:p>
     <w:p>
-      <w:pPr>
-        <w:rPr>
-          <w:lang w:val="en-IL"/>
-        </w:rPr>
-      </w:pPr>
-      <w:r>
-        <w:rPr>
-          <w:lang w:val="en-IL"/>
-        </w:rPr>
+      <w:r>
         <w:t>After the drawing is complete, the magnets are removed.</w:t>
       </w:r>
     </w:p>
     <w:p>
-      <w:pPr>
-        <w:rPr>
-          <w:lang w:val="en-IL"/>
-        </w:rPr>
-      </w:pPr>
-      <w:r>
-        <w:rPr>
-          <w:b/>
-          <w:bCs/>
-          <w:lang w:val="en-IL"/>
+      <w:r>
+        <w:rPr>
+          <w:b/>
+          <w:bCs/>
         </w:rPr>
         <w:t>5. Cut the portrait</w:t>
       </w:r>
     </w:p>
     <w:p>
-      <w:pPr>
-        <w:rPr>
-          <w:lang w:val="en-IL"/>
-        </w:rPr>
-      </w:pPr>
-      <w:r>
-        <w:rPr>
-          <w:lang w:val="en-IL"/>
-        </w:rPr>
+      <w:r>
         <w:t>The robot picks up the cutting tool and cuts the completed portrait from the paper roll.</w:t>
       </w:r>
     </w:p>
     <w:p>
-      <w:pPr>
-        <w:rPr>
-          <w:lang w:val="en-IL"/>
-        </w:rPr>
-      </w:pPr>
-      <w:r>
-        <w:rPr>
-          <w:b/>
-          <w:bCs/>
-          <w:lang w:val="en-IL"/>
-        </w:rPr>
-        <w:t>6. Final result</w:t>
-      </w:r>
-    </w:p>
-    <w:p>
-      <w:pPr>
-        <w:rPr>
-          <w:lang w:val="en-IL"/>
-        </w:rPr>
-      </w:pPr>
-      <w:r>
-        <w:rPr>
-          <w:lang w:val="en-IL"/>
-        </w:rPr>
+      <w:r>
+        <w:rPr>
+          <w:b/>
+          <w:bCs/>
+        </w:rPr>
+        <w:t xml:space="preserve">6. </w:t>
+      </w:r>
+      <w:proofErr w:type="gramStart"/>
+      <w:r>
+        <w:rPr>
+          <w:b/>
+          <w:bCs/>
+        </w:rPr>
+        <w:t>Final result</w:t>
+      </w:r>
+      <w:proofErr w:type="gramEnd"/>
+    </w:p>
+    <w:p>
+      <w:r>
         <w:t>The completed portrait is then ready for the user to collect.</w:t>
       </w:r>
     </w:p>
     <w:p>
-      <w:pPr>
-        <w:rPr>
-          <w:lang w:val="en-IL"/>
-        </w:rPr>
-      </w:pPr>
-      <w:r>
-        <w:rPr>
-          <w:lang w:val="en-IL"/>
-        </w:rPr>
+      <w:r>
         <w:pict w14:anchorId="009D8B52">
-          <v:rect id="_x0000_i1117" style="width:0;height:1.5pt" o:hralign="center" o:hrstd="t" o:hr="t" fillcolor="#a0a0a0" stroked="f"/>
+          <v:rect id="_x0000_i1032" style="width:0;height:1.5pt" o:hralign="center" o:hrstd="t" o:hr="t" fillcolor="#a0a0a0" stroked="f"/>
         </w:pict>
       </w:r>
     </w:p>
@@ -2915,14 +2572,12 @@
         <w:rPr>
           <w:b/>
           <w:bCs/>
-          <w:lang w:val="en-IL"/>
-        </w:rPr>
-      </w:pPr>
-      <w:r>
-        <w:rPr>
-          <w:b/>
-          <w:bCs/>
-          <w:lang w:val="en-IL"/>
+        </w:rPr>
+      </w:pPr>
+      <w:r>
+        <w:rPr>
+          <w:b/>
+          <w:bCs/>
         </w:rPr>
         <w:t>Slide 10 — Functionality That Was Removed</w:t>
       </w:r>
@@ -2932,7 +2587,6 @@
           <w:b/>
           <w:bCs/>
           <w:rtl/>
-          <w:lang w:val="en-IL"/>
         </w:rPr>
         <w:t xml:space="preserve"> </w:t>
       </w:r>
@@ -2941,7 +2595,6 @@
           <w:b/>
           <w:bCs/>
           <w:rtl/>
-          <w:lang w:val="en-IL"/>
         </w:rPr>
         <w:t>–</w:t>
       </w:r>
@@ -2951,145 +2604,82 @@
           <w:b/>
           <w:bCs/>
           <w:rtl/>
-          <w:lang w:val="en-IL"/>
         </w:rPr>
         <w:t xml:space="preserve"> לא מדויק  </w:t>
       </w:r>
     </w:p>
     <w:p>
-      <w:pPr>
-        <w:rPr>
-          <w:lang w:val="en-IL"/>
-        </w:rPr>
-      </w:pPr>
-      <w:r>
-        <w:rPr>
-          <w:lang w:val="en-IL"/>
-        </w:rPr>
+      <w:r>
         <w:lastRenderedPageBreak/>
-        <w:t>During development, we decided to remove several features from the original design in order to focus on a more reliable and practical system.</w:t>
-      </w:r>
-    </w:p>
-    <w:p>
-      <w:pPr>
-        <w:rPr>
-          <w:lang w:val="en-IL"/>
-        </w:rPr>
-      </w:pPr>
-      <w:r>
-        <w:rPr>
-          <w:b/>
-          <w:bCs/>
-          <w:lang w:val="en-IL"/>
+        <w:t xml:space="preserve">During development, we decided to remove several features from the original design </w:t>
+      </w:r>
+      <w:proofErr w:type="gramStart"/>
+      <w:r>
+        <w:t>in order to</w:t>
+      </w:r>
+      <w:proofErr w:type="gramEnd"/>
+      <w:r>
+        <w:t xml:space="preserve"> focus on a more reliable and practical system.</w:t>
+      </w:r>
+    </w:p>
+    <w:p>
+      <w:r>
+        <w:rPr>
+          <w:b/>
+          <w:bCs/>
         </w:rPr>
         <w:t>Directly handing the portrait to the user</w:t>
       </w:r>
     </w:p>
     <w:p>
-      <w:pPr>
-        <w:rPr>
-          <w:lang w:val="en-IL"/>
-        </w:rPr>
-      </w:pPr>
-      <w:r>
-        <w:rPr>
-          <w:lang w:val="en-IL"/>
-        </w:rPr>
+      <w:r>
         <w:t>Originally, the robot was supposed to pick up the finished sheet and hand it directly to the user.</w:t>
       </w:r>
     </w:p>
     <w:p>
-      <w:pPr>
-        <w:rPr>
-          <w:lang w:val="en-IL"/>
-        </w:rPr>
-      </w:pPr>
-      <w:r>
-        <w:rPr>
-          <w:lang w:val="en-IL"/>
-        </w:rPr>
+      <w:r>
         <w:t>We removed this functionality because handling a thin and flexible sheet of paper reliably would significantly increase the mechanical complexity of the system.</w:t>
       </w:r>
     </w:p>
     <w:p>
-      <w:pPr>
-        <w:rPr>
-          <w:lang w:val="en-IL"/>
-        </w:rPr>
-      </w:pPr>
-      <w:r>
-        <w:rPr>
-          <w:lang w:val="en-IL"/>
-        </w:rPr>
+      <w:r>
         <w:t>Instead, the portrait is cut from the paper roll and made available for the user to collect.</w:t>
       </w:r>
     </w:p>
     <w:p>
-      <w:pPr>
-        <w:rPr>
-          <w:lang w:val="en-IL"/>
-        </w:rPr>
-      </w:pPr>
-      <w:r>
-        <w:rPr>
-          <w:b/>
-          <w:bCs/>
-          <w:lang w:val="en-IL"/>
+      <w:r>
+        <w:rPr>
+          <w:b/>
+          <w:bCs/>
         </w:rPr>
         <w:t>Original paper-separation mechanism</w:t>
       </w:r>
     </w:p>
     <w:p>
-      <w:pPr>
-        <w:rPr>
-          <w:lang w:val="en-IL"/>
-        </w:rPr>
-      </w:pPr>
-      <w:r>
-        <w:rPr>
-          <w:lang w:val="en-IL"/>
-        </w:rPr>
+      <w:r>
         <w:t>Originally, we considered using a different mechanism to separate the finished drawing from the paper.</w:t>
       </w:r>
     </w:p>
     <w:p>
-      <w:pPr>
-        <w:rPr>
-          <w:lang w:val="en-IL"/>
-        </w:rPr>
-      </w:pPr>
-      <w:r>
-        <w:rPr>
-          <w:lang w:val="en-IL"/>
-        </w:rPr>
+      <w:r>
         <w:t xml:space="preserve">Instead, we decided to use a </w:t>
       </w:r>
       <w:r>
         <w:rPr>
           <w:b/>
           <w:bCs/>
-          <w:lang w:val="en-IL"/>
         </w:rPr>
         <w:t>cutting tool mounted on the system</w:t>
       </w:r>
       <w:r>
-        <w:rPr>
-          <w:lang w:val="en-IL"/>
-        </w:rPr>
         <w:t>, which provided a more controlled and predictable cutting process.</w:t>
       </w:r>
     </w:p>
     <w:p>
-      <w:pPr>
-        <w:rPr>
-          <w:lang w:val="en-IL"/>
-        </w:rPr>
-      </w:pPr>
-      <w:r>
-        <w:rPr>
-          <w:b/>
-          <w:bCs/>
-          <w:lang w:val="en-IL"/>
+      <w:r>
+        <w:rPr>
+          <w:b/>
+          <w:bCs/>
         </w:rPr>
         <w:t>Original stamp design</w:t>
       </w:r>
@@ -3097,39 +2687,22 @@
     <w:p>
       <w:pPr>
         <w:rPr>
+          <w:rtl/>
+        </w:rPr>
+      </w:pPr>
+      <w:r>
+        <w:rPr>
           <w:rFonts w:hint="cs"/>
           <w:rtl/>
-          <w:lang w:val="en-IL"/>
-        </w:rPr>
-      </w:pPr>
-      <w:r>
-        <w:rPr>
-          <w:rFonts w:hint="cs"/>
-          <w:rtl/>
-          <w:lang w:val="en-IL"/>
         </w:rPr>
         <w:t>להוסיף</w:t>
       </w:r>
     </w:p>
-    <w:p>
-      <w:pPr>
-        <w:rPr>
-          <w:lang w:val="en-IL"/>
-        </w:rPr>
-      </w:pPr>
-    </w:p>
-    <w:p>
-      <w:pPr>
-        <w:rPr>
-          <w:lang w:val="en-IL"/>
-        </w:rPr>
-      </w:pPr>
-      <w:r>
-        <w:rPr>
-          <w:lang w:val="en-IL"/>
-        </w:rPr>
+    <w:p/>
+    <w:p>
+      <w:r>
         <w:pict w14:anchorId="36F6845C">
-          <v:rect id="_x0000_i1118" style="width:0;height:1.5pt" o:hralign="center" o:hrstd="t" o:hr="t" fillcolor="#a0a0a0" stroked="f"/>
+          <v:rect id="_x0000_i1033" style="width:0;height:1.5pt" o:hralign="center" o:hrstd="t" o:hr="t" fillcolor="#a0a0a0" stroked="f"/>
         </w:pict>
       </w:r>
     </w:p>
@@ -3138,68 +2711,38 @@
         <w:rPr>
           <w:b/>
           <w:bCs/>
-          <w:lang w:val="en-IL"/>
-        </w:rPr>
-      </w:pPr>
-      <w:r>
-        <w:rPr>
-          <w:b/>
-          <w:bCs/>
-          <w:lang w:val="en-IL"/>
+        </w:rPr>
+      </w:pPr>
+      <w:r>
+        <w:rPr>
+          <w:b/>
+          <w:bCs/>
         </w:rPr>
         <w:t>Slide 11 — Functionality We Added</w:t>
       </w:r>
     </w:p>
     <w:p>
-      <w:pPr>
-        <w:rPr>
-          <w:lang w:val="en-IL"/>
-        </w:rPr>
-      </w:pPr>
-      <w:r>
-        <w:rPr>
-          <w:lang w:val="en-IL"/>
-        </w:rPr>
+      <w:r>
         <w:t>In addition to removing some original ideas, we also introduced several new features that were not part of the initial design.</w:t>
       </w:r>
     </w:p>
     <w:p>
-      <w:pPr>
-        <w:rPr>
-          <w:lang w:val="en-IL"/>
-        </w:rPr>
-      </w:pPr>
-      <w:r>
-        <w:rPr>
-          <w:lang w:val="en-IL"/>
-        </w:rPr>
+      <w:r>
         <w:t xml:space="preserve">The most important addition was the </w:t>
       </w:r>
       <w:r>
         <w:rPr>
           <w:b/>
           <w:bCs/>
-          <w:lang w:val="en-IL"/>
         </w:rPr>
         <w:t>continuous paper roll system</w:t>
       </w:r>
       <w:r>
-        <w:rPr>
-          <w:lang w:val="en-IL"/>
-        </w:rPr>
         <w:t>.</w:t>
       </w:r>
     </w:p>
     <w:p>
-      <w:pPr>
-        <w:rPr>
-          <w:lang w:val="en-IL"/>
-        </w:rPr>
-      </w:pPr>
-      <w:r>
-        <w:rPr>
-          <w:lang w:val="en-IL"/>
-        </w:rPr>
+      <w:r>
         <w:t>Instead of manually inserting a new sheet for every user:</w:t>
       </w:r>
     </w:p>
@@ -3209,14 +2752,8 @@
           <w:ilvl w:val="0"/>
           <w:numId w:val="18"/>
         </w:numPr>
-        <w:rPr>
-          <w:lang w:val="en-IL"/>
-        </w:rPr>
-      </w:pPr>
-      <w:r>
-        <w:rPr>
-          <w:lang w:val="en-IL"/>
-        </w:rPr>
+      </w:pPr>
+      <w:r>
         <w:t xml:space="preserve">The system pulls the required amount of paper from the roll. </w:t>
       </w:r>
     </w:p>
@@ -3226,14 +2763,8 @@
           <w:ilvl w:val="0"/>
           <w:numId w:val="18"/>
         </w:numPr>
-        <w:rPr>
-          <w:lang w:val="en-IL"/>
-        </w:rPr>
-      </w:pPr>
-      <w:r>
-        <w:rPr>
-          <w:lang w:val="en-IL"/>
-        </w:rPr>
+      </w:pPr>
+      <w:r>
         <w:t xml:space="preserve">The paper is positioned and secured using magnets. </w:t>
       </w:r>
     </w:p>
@@ -3243,14 +2774,8 @@
           <w:ilvl w:val="0"/>
           <w:numId w:val="18"/>
         </w:numPr>
-        <w:rPr>
-          <w:lang w:val="en-IL"/>
-        </w:rPr>
-      </w:pPr>
-      <w:r>
-        <w:rPr>
-          <w:lang w:val="en-IL"/>
-        </w:rPr>
+      </w:pPr>
+      <w:r>
         <w:t xml:space="preserve">The portrait is drawn. </w:t>
       </w:r>
     </w:p>
@@ -3260,14 +2785,8 @@
           <w:ilvl w:val="0"/>
           <w:numId w:val="18"/>
         </w:numPr>
-        <w:rPr>
-          <w:lang w:val="en-IL"/>
-        </w:rPr>
-      </w:pPr>
-      <w:r>
-        <w:rPr>
-          <w:lang w:val="en-IL"/>
-        </w:rPr>
+      </w:pPr>
+      <w:r>
         <w:t xml:space="preserve">The magnets are released. </w:t>
       </w:r>
     </w:p>
@@ -3277,14 +2796,8 @@
           <w:ilvl w:val="0"/>
           <w:numId w:val="18"/>
         </w:numPr>
-        <w:rPr>
-          <w:lang w:val="en-IL"/>
-        </w:rPr>
-      </w:pPr>
-      <w:r>
-        <w:rPr>
-          <w:lang w:val="en-IL"/>
-        </w:rPr>
+      </w:pPr>
+      <w:r>
         <w:t xml:space="preserve">The robot cuts the finished drawing. </w:t>
       </w:r>
     </w:p>
@@ -3294,43 +2807,29 @@
           <w:ilvl w:val="0"/>
           <w:numId w:val="18"/>
         </w:numPr>
-        <w:rPr>
-          <w:lang w:val="en-IL"/>
-        </w:rPr>
-      </w:pPr>
-      <w:r>
-        <w:rPr>
-          <w:lang w:val="en-IL"/>
-        </w:rPr>
+      </w:pPr>
+      <w:r>
         <w:t xml:space="preserve">The system is then ready for the next portrait. </w:t>
       </w:r>
     </w:p>
     <w:p>
-      <w:pPr>
-        <w:rPr>
-          <w:lang w:val="en-IL"/>
-        </w:rPr>
-      </w:pPr>
-      <w:r>
-        <w:rPr>
-          <w:lang w:val="en-IL"/>
-        </w:rPr>
-        <w:t>This change makes PortraTron much more suitable for continuous operation with multiple users.</w:t>
-      </w:r>
-    </w:p>
-    <w:p>
-      <w:pPr>
-        <w:rPr>
-          <w:lang w:val="en-IL"/>
-        </w:rPr>
-      </w:pPr>
-      <w:r>
-        <w:rPr>
-          <w:lang w:val="en-IL"/>
-        </w:rPr>
+      <w:r>
+        <w:t xml:space="preserve">This change makes </w:t>
+      </w:r>
+      <w:proofErr w:type="spellStart"/>
+      <w:r>
+        <w:t>PortraTron</w:t>
+      </w:r>
+      <w:proofErr w:type="spellEnd"/>
+      <w:r>
+        <w:t xml:space="preserve"> much more suitable for continuous operation with multiple users.</w:t>
+      </w:r>
+    </w:p>
+    <w:p>
+      <w:r>
         <w:lastRenderedPageBreak/>
         <w:pict w14:anchorId="2A408069">
-          <v:rect id="_x0000_i1119" style="width:0;height:1.5pt" o:hralign="center" o:hrstd="t" o:hr="t" fillcolor="#a0a0a0" stroked="f"/>
+          <v:rect id="_x0000_i1034" style="width:0;height:1.5pt" o:hralign="center" o:hrstd="t" o:hr="t" fillcolor="#a0a0a0" stroked="f"/>
         </w:pict>
       </w:r>
     </w:p>
@@ -3339,29 +2838,21 @@
         <w:rPr>
           <w:b/>
           <w:bCs/>
-          <w:lang w:val="en-IL"/>
-        </w:rPr>
-      </w:pPr>
-      <w:r>
-        <w:rPr>
-          <w:b/>
-          <w:bCs/>
-          <w:lang w:val="en-IL"/>
+        </w:rPr>
+      </w:pPr>
+      <w:r>
+        <w:rPr>
+          <w:b/>
+          <w:bCs/>
         </w:rPr>
         <w:t>Slide 12 — Development Process &amp; Project Experience</w:t>
       </w:r>
     </w:p>
     <w:p>
-      <w:pPr>
-        <w:rPr>
-          <w:lang w:val="en-IL"/>
-        </w:rPr>
-      </w:pPr>
-      <w:r>
-        <w:rPr>
-          <w:b/>
-          <w:bCs/>
-          <w:lang w:val="en-IL"/>
+      <w:r>
+        <w:rPr>
+          <w:b/>
+          <w:bCs/>
         </w:rPr>
         <w:t>Throughout the project, we went through multiple iterations of design, testing, failure, and improvement. Almost every major component of the system evolved based on what we learned during real-world testing.</w:t>
       </w:r>
@@ -3370,7 +2861,6 @@
           <w:b/>
           <w:bCs/>
           <w:rtl/>
-          <w:lang w:val="en-IL"/>
         </w:rPr>
         <w:br/>
       </w:r>
@@ -3380,23 +2870,14 @@
           <w:b/>
           <w:bCs/>
           <w:rtl/>
-          <w:lang w:val="en-IL"/>
         </w:rPr>
         <w:t>הרגנו טושים....</w:t>
       </w:r>
     </w:p>
     <w:p>
-      <w:pPr>
-        <w:rPr>
-          <w:lang w:val="en-IL"/>
-        </w:rPr>
-      </w:pPr>
-      <w:r>
-        <w:rPr>
-          <w:lang w:val="en-IL"/>
-        </w:rPr>
+      <w:r>
         <w:pict w14:anchorId="078B09ED">
-          <v:rect id="_x0000_i1120" style="width:0;height:1.5pt" o:hralign="center" o:hrstd="t" o:hr="t" fillcolor="#a0a0a0" stroked="f"/>
+          <v:rect id="_x0000_i1035" style="width:0;height:1.5pt" o:hralign="center" o:hrstd="t" o:hr="t" fillcolor="#a0a0a0" stroked="f"/>
         </w:pict>
       </w:r>
     </w:p>
@@ -3405,30 +2886,20 @@
         <w:rPr>
           <w:b/>
           <w:bCs/>
-          <w:lang w:val="en-IL"/>
-        </w:rPr>
-      </w:pPr>
-      <w:r>
-        <w:rPr>
-          <w:b/>
-          <w:bCs/>
-          <w:lang w:val="en-IL"/>
+        </w:rPr>
+      </w:pPr>
+      <w:r>
+        <w:rPr>
+          <w:b/>
+          <w:bCs/>
         </w:rPr>
         <w:t>Slide 13 — The Main Engineering Challenge</w:t>
       </w:r>
     </w:p>
     <w:p>
-      <w:pPr>
-        <w:rPr>
-          <w:lang w:val="en-IL"/>
-        </w:rPr>
-      </w:pPr>
-      <w:r>
-        <w:rPr>
-          <w:lang w:val="en-IL"/>
-        </w:rPr>
+      <w:r>
         <w:pict w14:anchorId="7C086B09">
-          <v:rect id="_x0000_i1121" style="width:0;height:1.5pt" o:hralign="center" o:hrstd="t" o:hr="t" fillcolor="#a0a0a0" stroked="f"/>
+          <v:rect id="_x0000_i1036" style="width:0;height:1.5pt" o:hralign="center" o:hrstd="t" o:hr="t" fillcolor="#a0a0a0" stroked="f"/>
         </w:pict>
       </w:r>
     </w:p>
@@ -3437,84 +2908,55 @@
         <w:rPr>
           <w:b/>
           <w:bCs/>
-          <w:lang w:val="en-IL"/>
-        </w:rPr>
-      </w:pPr>
-      <w:r>
-        <w:rPr>
-          <w:b/>
-          <w:bCs/>
-          <w:lang w:val="en-IL"/>
+        </w:rPr>
+      </w:pPr>
+      <w:r>
+        <w:rPr>
+          <w:b/>
+          <w:bCs/>
         </w:rPr>
         <w:t>Slide 14 — The Final Product</w:t>
       </w:r>
     </w:p>
     <w:p>
-      <w:pPr>
-        <w:rPr>
-          <w:lang w:val="en-IL"/>
-        </w:rPr>
-      </w:pPr>
-      <w:r>
-        <w:rPr>
-          <w:b/>
-          <w:bCs/>
-          <w:lang w:val="en-IL"/>
-        </w:rPr>
-        <w:t>PortraTron is an end-to-end robotic system that converts a photograph of a person into a physical portrait automatically.</w:t>
-      </w:r>
-    </w:p>
-    <w:p>
-      <w:pPr>
-        <w:rPr>
-          <w:lang w:val="en-IL"/>
-        </w:rPr>
-      </w:pPr>
-      <w:r>
-        <w:rPr>
-          <w:lang w:val="en-IL"/>
-        </w:rPr>
+      <w:proofErr w:type="spellStart"/>
+      <w:r>
+        <w:rPr>
+          <w:b/>
+          <w:bCs/>
+        </w:rPr>
+        <w:t>PortraTron</w:t>
+      </w:r>
+      <w:proofErr w:type="spellEnd"/>
+      <w:r>
+        <w:rPr>
+          <w:b/>
+          <w:bCs/>
+        </w:rPr>
+        <w:t xml:space="preserve"> is an end-to-end robotic system that converts a photograph of a person into a physical portrait automatically.</w:t>
+      </w:r>
+    </w:p>
+    <w:p>
+      <w:r>
         <w:t>The complete process is:</w:t>
       </w:r>
     </w:p>
     <w:p>
-      <w:pPr>
-        <w:rPr>
-          <w:lang w:val="en-IL"/>
-        </w:rPr>
-      </w:pPr>
-      <w:r>
-        <w:rPr>
-          <w:b/>
-          <w:bCs/>
-          <w:lang w:val="en-IL"/>
+      <w:r>
+        <w:rPr>
+          <w:b/>
+          <w:bCs/>
         </w:rPr>
         <w:t>Scan QR Code → Take Photo → Generate Sketch → User Approval → Generate Strokes → Prepare Paper → Draw → Cut → Finished Portrait</w:t>
       </w:r>
     </w:p>
     <w:p>
-      <w:pPr>
-        <w:rPr>
-          <w:lang w:val="en-IL"/>
-        </w:rPr>
-      </w:pPr>
-      <w:r>
-        <w:rPr>
-          <w:lang w:val="en-IL"/>
-        </w:rPr>
+      <w:r>
         <w:t>The result is not simply a printed image.</w:t>
       </w:r>
     </w:p>
     <w:p>
-      <w:pPr>
-        <w:rPr>
-          <w:lang w:val="en-IL"/>
-        </w:rPr>
-      </w:pPr>
-      <w:r>
-        <w:rPr>
-          <w:lang w:val="en-IL"/>
-        </w:rPr>
+      <w:r>
         <w:t>The user receives a personalized physical portrait while also experiencing the process of watching a robot create it in real time.</w:t>
       </w:r>
       <w:r>
@@ -3522,7 +2964,6 @@
           <w:b/>
           <w:bCs/>
           <w:rtl/>
-          <w:lang w:val="en-IL"/>
         </w:rPr>
         <w:br/>
       </w:r>
@@ -3532,18 +2973,11 @@
           <w:b/>
           <w:bCs/>
           <w:rtl/>
-          <w:lang w:val="en-IL"/>
         </w:rPr>
         <w:t>ופה נראה לי שאפשר לשים את הברקוד</w:t>
       </w:r>
     </w:p>
-    <w:p>
-      <w:pPr>
-        <w:rPr>
-          <w:lang w:val="en-US"/>
-        </w:rPr>
-      </w:pPr>
-    </w:p>
+    <w:p/>
     <w:sectPr>
       <w:pgSz w:w="11906" w:h="16838"/>
       <w:pgMar w:top="1440" w:right="1440" w:bottom="1440" w:left="1440" w:header="708" w:footer="708" w:gutter="0"/>
@@ -4081,6 +3515,155 @@
     </w:lvl>
   </w:abstractNum>
   <w:abstractNum w:abstractNumId="4" w15:restartNumberingAfterBreak="0">
+    <w:nsid w:val="240C0D3E"/>
+    <w:multiLevelType w:val="multilevel"/>
+    <w:tmpl w:val="752CA052"/>
+    <w:lvl w:ilvl="0">
+      <w:start w:val="1"/>
+      <w:numFmt w:val="bullet"/>
+      <w:lvlText w:val=""/>
+      <w:lvlJc w:val="left"/>
+      <w:pPr>
+        <w:tabs>
+          <w:tab w:val="num" w:pos="720"/>
+        </w:tabs>
+        <w:ind w:left="720" w:hanging="360"/>
+      </w:pPr>
+      <w:rPr>
+        <w:rFonts w:ascii="Symbol" w:hAnsi="Symbol" w:hint="default"/>
+        <w:sz w:val="20"/>
+      </w:rPr>
+    </w:lvl>
+    <w:lvl w:ilvl="1" w:tentative="1">
+      <w:start w:val="1"/>
+      <w:numFmt w:val="bullet"/>
+      <w:lvlText w:val="o"/>
+      <w:lvlJc w:val="left"/>
+      <w:pPr>
+        <w:tabs>
+          <w:tab w:val="num" w:pos="1440"/>
+        </w:tabs>
+        <w:ind w:left="1440" w:hanging="360"/>
+      </w:pPr>
+      <w:rPr>
+        <w:rFonts w:ascii="Courier New" w:hAnsi="Courier New" w:hint="default"/>
+        <w:sz w:val="20"/>
+      </w:rPr>
+    </w:lvl>
+    <w:lvl w:ilvl="2" w:tentative="1">
+      <w:start w:val="1"/>
+      <w:numFmt w:val="bullet"/>
+      <w:lvlText w:val=""/>
+      <w:lvlJc w:val="left"/>
+      <w:pPr>
+        <w:tabs>
+          <w:tab w:val="num" w:pos="2160"/>
+        </w:tabs>
+        <w:ind w:left="2160" w:hanging="360"/>
+      </w:pPr>
+      <w:rPr>
+        <w:rFonts w:ascii="Wingdings" w:hAnsi="Wingdings" w:hint="default"/>
+        <w:sz w:val="20"/>
+      </w:rPr>
+    </w:lvl>
+    <w:lvl w:ilvl="3" w:tentative="1">
+      <w:start w:val="1"/>
+      <w:numFmt w:val="bullet"/>
+      <w:lvlText w:val=""/>
+      <w:lvlJc w:val="left"/>
+      <w:pPr>
+        <w:tabs>
+          <w:tab w:val="num" w:pos="2880"/>
+        </w:tabs>
+        <w:ind w:left="2880" w:hanging="360"/>
+      </w:pPr>
+      <w:rPr>
+        <w:rFonts w:ascii="Wingdings" w:hAnsi="Wingdings" w:hint="default"/>
+        <w:sz w:val="20"/>
+      </w:rPr>
+    </w:lvl>
+    <w:lvl w:ilvl="4" w:tentative="1">
+      <w:start w:val="1"/>
+      <w:numFmt w:val="bullet"/>
+      <w:lvlText w:val=""/>
+      <w:lvlJc w:val="left"/>
+      <w:pPr>
+        <w:tabs>
+          <w:tab w:val="num" w:pos="3600"/>
+        </w:tabs>
+        <w:ind w:left="3600" w:hanging="360"/>
+      </w:pPr>
+      <w:rPr>
+        <w:rFonts w:ascii="Wingdings" w:hAnsi="Wingdings" w:hint="default"/>
+        <w:sz w:val="20"/>
+      </w:rPr>
+    </w:lvl>
+    <w:lvl w:ilvl="5" w:tentative="1">
+      <w:start w:val="1"/>
+      <w:numFmt w:val="bullet"/>
+      <w:lvlText w:val=""/>
+      <w:lvlJc w:val="left"/>
+      <w:pPr>
+        <w:tabs>
+          <w:tab w:val="num" w:pos="4320"/>
+        </w:tabs>
+        <w:ind w:left="4320" w:hanging="360"/>
+      </w:pPr>
+      <w:rPr>
+        <w:rFonts w:ascii="Wingdings" w:hAnsi="Wingdings" w:hint="default"/>
+        <w:sz w:val="20"/>
+      </w:rPr>
+    </w:lvl>
+    <w:lvl w:ilvl="6" w:tentative="1">
+      <w:start w:val="1"/>
+      <w:numFmt w:val="bullet"/>
+      <w:lvlText w:val=""/>
+      <w:lvlJc w:val="left"/>
+      <w:pPr>
+        <w:tabs>
+          <w:tab w:val="num" w:pos="5040"/>
+        </w:tabs>
+        <w:ind w:left="5040" w:hanging="360"/>
+      </w:pPr>
+      <w:rPr>
+        <w:rFonts w:ascii="Wingdings" w:hAnsi="Wingdings" w:hint="default"/>
+        <w:sz w:val="20"/>
+      </w:rPr>
+    </w:lvl>
+    <w:lvl w:ilvl="7" w:tentative="1">
+      <w:start w:val="1"/>
+      <w:numFmt w:val="bullet"/>
+      <w:lvlText w:val=""/>
+      <w:lvlJc w:val="left"/>
+      <w:pPr>
+        <w:tabs>
+          <w:tab w:val="num" w:pos="5760"/>
+        </w:tabs>
+        <w:ind w:left="5760" w:hanging="360"/>
+      </w:pPr>
+      <w:rPr>
+        <w:rFonts w:ascii="Wingdings" w:hAnsi="Wingdings" w:hint="default"/>
+        <w:sz w:val="20"/>
+      </w:rPr>
+    </w:lvl>
+    <w:lvl w:ilvl="8" w:tentative="1">
+      <w:start w:val="1"/>
+      <w:numFmt w:val="bullet"/>
+      <w:lvlText w:val=""/>
+      <w:lvlJc w:val="left"/>
+      <w:pPr>
+        <w:tabs>
+          <w:tab w:val="num" w:pos="6480"/>
+        </w:tabs>
+        <w:ind w:left="6480" w:hanging="360"/>
+      </w:pPr>
+      <w:rPr>
+        <w:rFonts w:ascii="Wingdings" w:hAnsi="Wingdings" w:hint="default"/>
+        <w:sz w:val="20"/>
+      </w:rPr>
+    </w:lvl>
+  </w:abstractNum>
+  <w:abstractNum w:abstractNumId="5" w15:restartNumberingAfterBreak="0">
     <w:nsid w:val="242D014A"/>
     <w:multiLevelType w:val="multilevel"/>
     <w:tmpl w:val="385A576C"/>
@@ -4229,7 +3812,7 @@
       </w:rPr>
     </w:lvl>
   </w:abstractNum>
-  <w:abstractNum w:abstractNumId="5" w15:restartNumberingAfterBreak="0">
+  <w:abstractNum w:abstractNumId="6" w15:restartNumberingAfterBreak="0">
     <w:nsid w:val="2EC203B3"/>
     <w:multiLevelType w:val="multilevel"/>
     <w:tmpl w:val="3892C712"/>
@@ -4378,7 +3961,7 @@
       </w:rPr>
     </w:lvl>
   </w:abstractNum>
-  <w:abstractNum w:abstractNumId="6" w15:restartNumberingAfterBreak="0">
+  <w:abstractNum w:abstractNumId="7" w15:restartNumberingAfterBreak="0">
     <w:nsid w:val="2F114DB1"/>
     <w:multiLevelType w:val="multilevel"/>
     <w:tmpl w:val="9454FB34"/>
@@ -4527,7 +4110,7 @@
       </w:rPr>
     </w:lvl>
   </w:abstractNum>
-  <w:abstractNum w:abstractNumId="7" w15:restartNumberingAfterBreak="0">
+  <w:abstractNum w:abstractNumId="8" w15:restartNumberingAfterBreak="0">
     <w:nsid w:val="3146185A"/>
     <w:multiLevelType w:val="multilevel"/>
     <w:tmpl w:val="D5A2480A"/>
@@ -4676,7 +4259,7 @@
       </w:rPr>
     </w:lvl>
   </w:abstractNum>
-  <w:abstractNum w:abstractNumId="8" w15:restartNumberingAfterBreak="0">
+  <w:abstractNum w:abstractNumId="9" w15:restartNumberingAfterBreak="0">
     <w:nsid w:val="43D50B7C"/>
     <w:multiLevelType w:val="multilevel"/>
     <w:tmpl w:val="854C40E4"/>
@@ -4825,7 +4408,7 @@
       </w:rPr>
     </w:lvl>
   </w:abstractNum>
-  <w:abstractNum w:abstractNumId="9" w15:restartNumberingAfterBreak="0">
+  <w:abstractNum w:abstractNumId="10" w15:restartNumberingAfterBreak="0">
     <w:nsid w:val="46F85714"/>
     <w:multiLevelType w:val="multilevel"/>
     <w:tmpl w:val="E4CABD7C"/>
@@ -4974,7 +4557,7 @@
       </w:rPr>
     </w:lvl>
   </w:abstractNum>
-  <w:abstractNum w:abstractNumId="10" w15:restartNumberingAfterBreak="0">
+  <w:abstractNum w:abstractNumId="11" w15:restartNumberingAfterBreak="0">
     <w:nsid w:val="487B586A"/>
     <w:multiLevelType w:val="multilevel"/>
     <w:tmpl w:val="5A40C6DC"/>
@@ -5123,7 +4706,7 @@
       </w:rPr>
     </w:lvl>
   </w:abstractNum>
-  <w:abstractNum w:abstractNumId="11" w15:restartNumberingAfterBreak="0">
+  <w:abstractNum w:abstractNumId="12" w15:restartNumberingAfterBreak="0">
     <w:nsid w:val="55E16B77"/>
     <w:multiLevelType w:val="multilevel"/>
     <w:tmpl w:val="E9C25BAA"/>
@@ -5236,7 +4819,7 @@
       </w:pPr>
     </w:lvl>
   </w:abstractNum>
-  <w:abstractNum w:abstractNumId="12" w15:restartNumberingAfterBreak="0">
+  <w:abstractNum w:abstractNumId="13" w15:restartNumberingAfterBreak="0">
     <w:nsid w:val="5D607EF3"/>
     <w:multiLevelType w:val="multilevel"/>
     <w:tmpl w:val="2452C9AE"/>
@@ -5385,7 +4968,7 @@
       </w:rPr>
     </w:lvl>
   </w:abstractNum>
-  <w:abstractNum w:abstractNumId="13" w15:restartNumberingAfterBreak="0">
+  <w:abstractNum w:abstractNumId="14" w15:restartNumberingAfterBreak="0">
     <w:nsid w:val="63C242C5"/>
     <w:multiLevelType w:val="multilevel"/>
     <w:tmpl w:val="74428DCE"/>
@@ -5534,7 +5117,7 @@
       </w:rPr>
     </w:lvl>
   </w:abstractNum>
-  <w:abstractNum w:abstractNumId="14" w15:restartNumberingAfterBreak="0">
+  <w:abstractNum w:abstractNumId="15" w15:restartNumberingAfterBreak="0">
     <w:nsid w:val="66744BEE"/>
     <w:multiLevelType w:val="multilevel"/>
     <w:tmpl w:val="3F2A9BF0"/>
@@ -5683,7 +5266,7 @@
       </w:rPr>
     </w:lvl>
   </w:abstractNum>
-  <w:abstractNum w:abstractNumId="15" w15:restartNumberingAfterBreak="0">
+  <w:abstractNum w:abstractNumId="16" w15:restartNumberingAfterBreak="0">
     <w:nsid w:val="6A6F66F0"/>
     <w:multiLevelType w:val="hybridMultilevel"/>
     <w:tmpl w:val="FB660860"/>
@@ -5796,7 +5379,7 @@
       </w:rPr>
     </w:lvl>
   </w:abstractNum>
-  <w:abstractNum w:abstractNumId="16" w15:restartNumberingAfterBreak="0">
+  <w:abstractNum w:abstractNumId="17" w15:restartNumberingAfterBreak="0">
     <w:nsid w:val="6DC623E8"/>
     <w:multiLevelType w:val="multilevel"/>
     <w:tmpl w:val="45DC7F64"/>
@@ -5945,7 +5528,7 @@
       </w:rPr>
     </w:lvl>
   </w:abstractNum>
-  <w:abstractNum w:abstractNumId="17" w15:restartNumberingAfterBreak="0">
+  <w:abstractNum w:abstractNumId="18" w15:restartNumberingAfterBreak="0">
     <w:nsid w:val="716B5BB4"/>
     <w:multiLevelType w:val="multilevel"/>
     <w:tmpl w:val="934AFA78"/>
@@ -6094,7 +5677,7 @@
       </w:rPr>
     </w:lvl>
   </w:abstractNum>
-  <w:abstractNum w:abstractNumId="18" w15:restartNumberingAfterBreak="0">
+  <w:abstractNum w:abstractNumId="19" w15:restartNumberingAfterBreak="0">
     <w:nsid w:val="73E27CB9"/>
     <w:multiLevelType w:val="multilevel"/>
     <w:tmpl w:val="121C3E8C"/>
@@ -6243,7 +5826,7 @@
       </w:rPr>
     </w:lvl>
   </w:abstractNum>
-  <w:abstractNum w:abstractNumId="19" w15:restartNumberingAfterBreak="0">
+  <w:abstractNum w:abstractNumId="20" w15:restartNumberingAfterBreak="0">
     <w:nsid w:val="7E986E67"/>
     <w:multiLevelType w:val="multilevel"/>
     <w:tmpl w:val="5D528394"/>
@@ -6392,7 +5975,7 @@
       </w:rPr>
     </w:lvl>
   </w:abstractNum>
-  <w:abstractNum w:abstractNumId="20" w15:restartNumberingAfterBreak="0">
+  <w:abstractNum w:abstractNumId="21" w15:restartNumberingAfterBreak="0">
     <w:nsid w:val="7FF82943"/>
     <w:multiLevelType w:val="multilevel"/>
     <w:tmpl w:val="431AAA7C"/>
@@ -6542,67 +6125,70 @@
     </w:lvl>
   </w:abstractNum>
   <w:num w:numId="1" w16cid:durableId="374159559">
-    <w:abstractNumId w:val="19"/>
+    <w:abstractNumId w:val="20"/>
   </w:num>
   <w:num w:numId="2" w16cid:durableId="808744589">
-    <w:abstractNumId w:val="15"/>
+    <w:abstractNumId w:val="16"/>
   </w:num>
   <w:num w:numId="3" w16cid:durableId="1922326561">
-    <w:abstractNumId w:val="18"/>
+    <w:abstractNumId w:val="19"/>
   </w:num>
   <w:num w:numId="4" w16cid:durableId="2012760130">
     <w:abstractNumId w:val="1"/>
   </w:num>
   <w:num w:numId="5" w16cid:durableId="1181553896">
-    <w:abstractNumId w:val="10"/>
+    <w:abstractNumId w:val="11"/>
   </w:num>
   <w:num w:numId="6" w16cid:durableId="2036930216">
-    <w:abstractNumId w:val="8"/>
+    <w:abstractNumId w:val="9"/>
   </w:num>
   <w:num w:numId="7" w16cid:durableId="1184828256">
-    <w:abstractNumId w:val="17"/>
+    <w:abstractNumId w:val="18"/>
   </w:num>
   <w:num w:numId="8" w16cid:durableId="818881934">
     <w:abstractNumId w:val="0"/>
   </w:num>
   <w:num w:numId="9" w16cid:durableId="1744059671">
+    <w:abstractNumId w:val="15"/>
+  </w:num>
+  <w:num w:numId="10" w16cid:durableId="1516185349">
     <w:abstractNumId w:val="14"/>
   </w:num>
-  <w:num w:numId="10" w16cid:durableId="1516185349">
-    <w:abstractNumId w:val="13"/>
-  </w:num>
   <w:num w:numId="11" w16cid:durableId="736437080">
-    <w:abstractNumId w:val="4"/>
+    <w:abstractNumId w:val="5"/>
   </w:num>
   <w:num w:numId="12" w16cid:durableId="1670206279">
-    <w:abstractNumId w:val="6"/>
+    <w:abstractNumId w:val="7"/>
   </w:num>
   <w:num w:numId="13" w16cid:durableId="108553654">
     <w:abstractNumId w:val="2"/>
   </w:num>
   <w:num w:numId="14" w16cid:durableId="1682511664">
-    <w:abstractNumId w:val="9"/>
+    <w:abstractNumId w:val="10"/>
   </w:num>
   <w:num w:numId="15" w16cid:durableId="245960368">
-    <w:abstractNumId w:val="7"/>
+    <w:abstractNumId w:val="8"/>
   </w:num>
   <w:num w:numId="16" w16cid:durableId="1396246857">
-    <w:abstractNumId w:val="5"/>
+    <w:abstractNumId w:val="6"/>
   </w:num>
   <w:num w:numId="17" w16cid:durableId="2039769941">
-    <w:abstractNumId w:val="11"/>
+    <w:abstractNumId w:val="12"/>
   </w:num>
   <w:num w:numId="18" w16cid:durableId="1336035149">
-    <w:abstractNumId w:val="12"/>
+    <w:abstractNumId w:val="13"/>
   </w:num>
   <w:num w:numId="19" w16cid:durableId="904560461">
     <w:abstractNumId w:val="3"/>
   </w:num>
   <w:num w:numId="20" w16cid:durableId="1781339469">
-    <w:abstractNumId w:val="20"/>
+    <w:abstractNumId w:val="21"/>
   </w:num>
   <w:num w:numId="21" w16cid:durableId="1250700015">
-    <w:abstractNumId w:val="16"/>
+    <w:abstractNumId w:val="17"/>
+  </w:num>
+  <w:num w:numId="22" w16cid:durableId="1774354349">
+    <w:abstractNumId w:val="4"/>
   </w:num>
 </w:numbering>
 </file>

</xml_diff>